<commit_message>
Align pilot operations and Mindforge audiences
</commit_message>
<xml_diff>
--- a/docs/content/exports/Competence-Hub_Abstimmung-Kernseiten_2026-09-04.docx
+++ b/docs/content/exports/Competence-Hub_Abstimmung-Kernseiten_2026-09-04.docx
@@ -1,6 +1,6 @@
 
 <file path=word/document.xml><?xml version="1.0" encoding="utf-8"?>
-<w:document xmlns:wpc="http://schemas.microsoft.com/office/word/2010/wordprocessingCanvas" xmlns:cx="http://schemas.microsoft.com/office/drawing/2014/chartex" xmlns:cx1="http://schemas.microsoft.com/office/drawing/2015/9/8/chartex" xmlns:cx2="http://schemas.microsoft.com/office/drawing/2015/10/21/chartex" xmlns:cx3="http://schemas.microsoft.com/office/drawing/2016/5/9/chartex" xmlns:cx4="http://schemas.microsoft.com/office/drawing/2016/5/10/chartex" xmlns:cx5="http://schemas.microsoft.com/office/drawing/2016/5/11/chartex" xmlns:cx6="http://schemas.microsoft.com/office/drawing/2016/5/12/chartex" xmlns:cx7="http://schemas.microsoft.com/office/drawing/2016/5/13/chartex" xmlns:cx8="http://schemas.microsoft.com/office/drawing/2016/5/14/chartex" xmlns:mc="http://schemas.openxmlformats.org/markup-compatibility/2006" xmlns:aink="http://schemas.microsoft.com/office/drawing/2016/ink" xmlns:am3d="http://schemas.microsoft.com/office/drawing/2017/model3d" xmlns:o="urn:schemas-microsoft-com:office:office" xmlns:oel="http://schemas.microsoft.com/office/2019/extlst" xmlns:r="http://schemas.openxmlformats.org/officeDocument/2006/relationships" xmlns:m="http://schemas.openxmlformats.org/officeDocument/2006/math" xmlns:v="urn:schemas-microsoft-com:vml" xmlns:wp14="http://schemas.microsoft.com/office/word/2010/wordprocessingDrawing" xmlns:wp="http://schemas.openxmlformats.org/drawingml/2006/wordprocessingDrawing" xmlns:w10="urn:schemas-microsoft-com:office:word" xmlns:w="http://schemas.openxmlformats.org/wordprocessingml/2006/main" xmlns:w14="http://schemas.microsoft.com/office/word/2010/wordml" xmlns:w15="http://schemas.microsoft.com/office/word/2012/wordml" xmlns:w16cex="http://schemas.microsoft.com/office/word/2018/wordml/cex" xmlns:w16cid="http://schemas.microsoft.com/office/word/2016/wordml/cid" xmlns:w16="http://schemas.microsoft.com/office/word/2018/wordml" xmlns:w16du="http://schemas.microsoft.com/office/word/2023/wordml/word16du" xmlns:w16sdtdh="http://schemas.microsoft.com/office/word/2020/wordml/sdtdatahash" xmlns:w16sdtfl="http://schemas.microsoft.com/office/word/2024/wordml/sdtformatlock" xmlns:w16se="http://schemas.microsoft.com/office/word/2015/wordml/symex" xmlns:wpg="http://schemas.microsoft.com/office/word/2010/wordprocessingGroup" xmlns:wpi="http://schemas.microsoft.com/office/word/2010/wordprocessingInk" xmlns:wne="http://schemas.microsoft.com/office/word/2006/wordml" xmlns:wps="http://schemas.microsoft.com/office/word/2010/wordprocessingShape" mc:Ignorable="w14 w15 w16se w16cid w16 w16cex w16sdtdh w16sdtfl w16du wp14">
+<w:document xmlns:wpc="http://schemas.microsoft.com/office/word/2010/wordprocessingCanvas" xmlns:cx="http://schemas.microsoft.com/office/drawing/2014/chartex" xmlns:cx1="http://schemas.microsoft.com/office/drawing/2015/9/8/chartex" xmlns:cx2="http://schemas.microsoft.com/office/drawing/2015/10/21/chartex" xmlns:cx3="http://schemas.microsoft.com/office/drawing/2016/5/9/chartex" xmlns:cx4="http://schemas.microsoft.com/office/drawing/2016/5/10/chartex" xmlns:cx5="http://schemas.microsoft.com/office/drawing/2016/5/11/chartex" xmlns:cx6="http://schemas.microsoft.com/office/drawing/2016/5/12/chartex" xmlns:cx7="http://schemas.microsoft.com/office/drawing/2016/5/13/chartex" xmlns:cx8="http://schemas.microsoft.com/office/drawing/2016/5/14/chartex" xmlns:mc="http://schemas.openxmlformats.org/markup-compatibility/2006" xmlns:aink="http://schemas.microsoft.com/office/drawing/2016/ink" xmlns:am3d="http://schemas.microsoft.com/office/drawing/2017/model3d" xmlns:o="urn:schemas-microsoft-com:office:office" xmlns:oel="http://schemas.microsoft.com/office/2019/extlst" xmlns:r="http://schemas.openxmlformats.org/officeDocument/2006/relationships" xmlns:m="http://schemas.openxmlformats.org/officeDocument/2006/math" xmlns:v="urn:schemas-microsoft-com:vml" xmlns:wp14="http://schemas.microsoft.com/office/word/2010/wordprocessingDrawing" xmlns:wp="http://schemas.openxmlformats.org/drawingml/2006/wordprocessingDrawing" xmlns:w10="urn:schemas-microsoft-com:office:word" xmlns:w="http://schemas.openxmlformats.org/wordprocessingml/2006/main" xmlns:w14="http://schemas.microsoft.com/office/word/2010/wordml" xmlns:w15="http://schemas.microsoft.com/office/word/2012/wordml" xmlns:w16cex="http://schemas.microsoft.com/office/word/2018/wordml/cex" xmlns:w16cid="http://schemas.microsoft.com/office/word/2016/wordml/cid" xmlns:w16="http://schemas.microsoft.com/office/word/2018/wordml" xmlns:w16sdtdh="http://schemas.microsoft.com/office/word/2020/wordml/sdtdatahash" xmlns:w16se="http://schemas.microsoft.com/office/word/2015/wordml/symex" xmlns:wpg="http://schemas.microsoft.com/office/word/2010/wordprocessingGroup" xmlns:wpi="http://schemas.microsoft.com/office/word/2010/wordprocessingInk" xmlns:wne="http://schemas.microsoft.com/office/word/2006/wordml" xmlns:wps="http://schemas.microsoft.com/office/word/2010/wordprocessingShape" mc:Ignorable="w14 w15 w16se w16cid w16 w16cex w16sdtdh wp14">
   <w:body>
     <w:p>
       <w:pPr>
@@ -25,12 +25,42 @@
         </w:rPr>
       </w:pPr>
       <w:bookmarkStart w:id="1" w:name="abstimmung-der-fünf-kernseiten"/>
+      <w:proofErr w:type="spellStart"/>
       <w:r>
         <w:rPr>
           <w:sz w:val="44"/>
         </w:rPr>
-        <w:t>Abstimmung der fünf Kernseiten</w:t>
-      </w:r>
+        <w:t>Abstimmung</w:t>
+      </w:r>
+      <w:proofErr w:type="spellEnd"/>
+      <w:r>
+        <w:rPr>
+          <w:sz w:val="44"/>
+        </w:rPr>
+        <w:t xml:space="preserve"> der </w:t>
+      </w:r>
+      <w:proofErr w:type="spellStart"/>
+      <w:r>
+        <w:rPr>
+          <w:sz w:val="44"/>
+        </w:rPr>
+        <w:t>fünf</w:t>
+      </w:r>
+      <w:proofErr w:type="spellEnd"/>
+      <w:r>
+        <w:rPr>
+          <w:sz w:val="44"/>
+        </w:rPr>
+        <w:t xml:space="preserve"> </w:t>
+      </w:r>
+      <w:proofErr w:type="spellStart"/>
+      <w:r>
+        <w:rPr>
+          <w:sz w:val="44"/>
+        </w:rPr>
+        <w:t>Kernseiten</w:t>
+      </w:r>
+      <w:proofErr w:type="spellEnd"/>
     </w:p>
     <w:p>
       <w:pPr>
@@ -40,13 +70,23 @@
           <w:color w:val="FF7E53"/>
         </w:rPr>
       </w:pPr>
+      <w:proofErr w:type="spellStart"/>
       <w:r>
         <w:rPr>
           <w:b/>
           <w:bCs/>
           <w:color w:val="FF7E53"/>
         </w:rPr>
-        <w:t>Entscheidungsvorlage · Stand: 04.09.2026</w:t>
+        <w:t>Entscheidungsvorlage</w:t>
+      </w:r>
+      <w:proofErr w:type="spellEnd"/>
+      <w:r>
+        <w:rPr>
+          <w:b/>
+          <w:bCs/>
+          <w:color w:val="FF7E53"/>
+        </w:rPr>
+        <w:t xml:space="preserve"> · Stand: 04.09.2026</w:t>
       </w:r>
     </w:p>
     <w:p>
@@ -59,17 +99,107 @@
       <w:r>
         <w:br w:type="page"/>
       </w:r>
+      <w:proofErr w:type="spellStart"/>
       <w:r>
         <w:lastRenderedPageBreak/>
-        <w:t>Worum es geht</w:t>
-      </w:r>
+        <w:t>Worum</w:t>
+      </w:r>
+      <w:proofErr w:type="spellEnd"/>
+      <w:r>
+        <w:t xml:space="preserve"> es </w:t>
+      </w:r>
+      <w:proofErr w:type="spellStart"/>
+      <w:r>
+        <w:t>geht</w:t>
+      </w:r>
+      <w:proofErr w:type="spellEnd"/>
     </w:p>
     <w:p>
       <w:pPr>
         <w:pStyle w:val="FirstParagraph"/>
       </w:pPr>
       <w:r>
-        <w:t>Für die fünf wichtigsten Seiten des Competence Hub liegen eine Bestandsaufnahme, eine Belegmatrix und ein Seitenplan vor:</w:t>
+        <w:t xml:space="preserve">Für die </w:t>
+      </w:r>
+      <w:proofErr w:type="spellStart"/>
+      <w:r>
+        <w:t>fünf</w:t>
+      </w:r>
+      <w:proofErr w:type="spellEnd"/>
+      <w:r>
+        <w:t xml:space="preserve"> </w:t>
+      </w:r>
+      <w:proofErr w:type="spellStart"/>
+      <w:r>
+        <w:t>wichtigsten</w:t>
+      </w:r>
+      <w:proofErr w:type="spellEnd"/>
+      <w:r>
+        <w:t xml:space="preserve"> Seiten des Competence Hub </w:t>
+      </w:r>
+      <w:proofErr w:type="spellStart"/>
+      <w:r>
+        <w:t>liegen</w:t>
+      </w:r>
+      <w:proofErr w:type="spellEnd"/>
+      <w:r>
+        <w:t xml:space="preserve"> </w:t>
+      </w:r>
+      <w:proofErr w:type="spellStart"/>
+      <w:r>
+        <w:t>eine</w:t>
+      </w:r>
+      <w:proofErr w:type="spellEnd"/>
+      <w:r>
+        <w:t xml:space="preserve"> </w:t>
+      </w:r>
+      <w:proofErr w:type="spellStart"/>
+      <w:r>
+        <w:t>Bestandsaufnahme</w:t>
+      </w:r>
+      <w:proofErr w:type="spellEnd"/>
+      <w:r>
+        <w:t xml:space="preserve">, </w:t>
+      </w:r>
+      <w:proofErr w:type="spellStart"/>
+      <w:r>
+        <w:t>eine</w:t>
+      </w:r>
+      <w:proofErr w:type="spellEnd"/>
+      <w:r>
+        <w:t xml:space="preserve"> </w:t>
+      </w:r>
+      <w:proofErr w:type="spellStart"/>
+      <w:r>
+        <w:t>Belegmatrix</w:t>
+      </w:r>
+      <w:proofErr w:type="spellEnd"/>
+      <w:r>
+        <w:t xml:space="preserve"> und </w:t>
+      </w:r>
+      <w:proofErr w:type="spellStart"/>
+      <w:r>
+        <w:t>ein</w:t>
+      </w:r>
+      <w:proofErr w:type="spellEnd"/>
+      <w:r>
+        <w:t xml:space="preserve"> </w:t>
+      </w:r>
+      <w:proofErr w:type="spellStart"/>
+      <w:r>
+        <w:t>Seitenplan</w:t>
+      </w:r>
+      <w:proofErr w:type="spellEnd"/>
+      <w:r>
+        <w:t xml:space="preserve"> </w:t>
+      </w:r>
+      <w:proofErr w:type="spellStart"/>
+      <w:r>
+        <w:t>vor</w:t>
+      </w:r>
+      <w:proofErr w:type="spellEnd"/>
+      <w:r>
+        <w:t>:</w:t>
       </w:r>
     </w:p>
     <w:p>
@@ -80,9 +210,11 @@
           <w:numId w:val="2"/>
         </w:numPr>
       </w:pPr>
+      <w:proofErr w:type="spellStart"/>
       <w:r>
         <w:t>Startseite</w:t>
       </w:r>
+      <w:proofErr w:type="spellEnd"/>
     </w:p>
     <w:p>
       <w:pPr>
@@ -92,9 +224,11 @@
           <w:numId w:val="2"/>
         </w:numPr>
       </w:pPr>
+      <w:proofErr w:type="spellStart"/>
       <w:r>
         <w:t>Unternehmen</w:t>
       </w:r>
+      <w:proofErr w:type="spellEnd"/>
     </w:p>
     <w:p>
       <w:pPr>
@@ -104,9 +238,11 @@
           <w:numId w:val="2"/>
         </w:numPr>
       </w:pPr>
+      <w:proofErr w:type="spellStart"/>
       <w:r>
         <w:t>Leistungen</w:t>
       </w:r>
+      <w:proofErr w:type="spellEnd"/>
     </w:p>
     <w:p>
       <w:pPr>
@@ -116,9 +252,11 @@
           <w:numId w:val="2"/>
         </w:numPr>
       </w:pPr>
+      <w:proofErr w:type="spellStart"/>
       <w:r>
         <w:t>Businesscoaching</w:t>
       </w:r>
+      <w:proofErr w:type="spellEnd"/>
     </w:p>
     <w:p>
       <w:pPr>
@@ -128,16 +266,178 @@
           <w:numId w:val="2"/>
         </w:numPr>
       </w:pPr>
+      <w:proofErr w:type="spellStart"/>
       <w:r>
         <w:t>Mindforge</w:t>
       </w:r>
+      <w:proofErr w:type="spellEnd"/>
     </w:p>
     <w:p>
       <w:pPr>
         <w:pStyle w:val="FirstParagraph"/>
       </w:pPr>
       <w:r>
-        <w:t>Bevor die öffentlichen Texte weiterentwickelt werden, benötigen wir acht kurze Entscheidungen. Damit vermeiden wir doppelte Inhalte, ungeprüfte Preise und fachliche Aussagen ohne klare Verantwortung.</w:t>
+        <w:t xml:space="preserve">Bevor die </w:t>
+      </w:r>
+      <w:proofErr w:type="spellStart"/>
+      <w:r>
+        <w:t>öffentlichen</w:t>
+      </w:r>
+      <w:proofErr w:type="spellEnd"/>
+      <w:r>
+        <w:t xml:space="preserve"> Texte </w:t>
+      </w:r>
+      <w:proofErr w:type="spellStart"/>
+      <w:r>
+        <w:t>weiterentwickelt</w:t>
+      </w:r>
+      <w:proofErr w:type="spellEnd"/>
+      <w:r>
+        <w:t xml:space="preserve"> </w:t>
+      </w:r>
+      <w:proofErr w:type="spellStart"/>
+      <w:r>
+        <w:t>werden</w:t>
+      </w:r>
+      <w:proofErr w:type="spellEnd"/>
+      <w:r>
+        <w:t xml:space="preserve">, </w:t>
+      </w:r>
+      <w:proofErr w:type="spellStart"/>
+      <w:r>
+        <w:t>benötigen</w:t>
+      </w:r>
+      <w:proofErr w:type="spellEnd"/>
+      <w:r>
+        <w:t xml:space="preserve"> </w:t>
+      </w:r>
+      <w:proofErr w:type="spellStart"/>
+      <w:r>
+        <w:t>wir</w:t>
+      </w:r>
+      <w:proofErr w:type="spellEnd"/>
+      <w:r>
+        <w:t xml:space="preserve"> </w:t>
+      </w:r>
+      <w:proofErr w:type="spellStart"/>
+      <w:r>
+        <w:t>acht</w:t>
+      </w:r>
+      <w:proofErr w:type="spellEnd"/>
+      <w:r>
+        <w:t xml:space="preserve"> </w:t>
+      </w:r>
+      <w:proofErr w:type="spellStart"/>
+      <w:r>
+        <w:t>kurze</w:t>
+      </w:r>
+      <w:proofErr w:type="spellEnd"/>
+      <w:r>
+        <w:t xml:space="preserve"> </w:t>
+      </w:r>
+      <w:proofErr w:type="spellStart"/>
+      <w:r>
+        <w:t>Entscheidungen</w:t>
+      </w:r>
+      <w:proofErr w:type="spellEnd"/>
+      <w:r>
+        <w:t xml:space="preserve">. </w:t>
+      </w:r>
+      <w:proofErr w:type="spellStart"/>
+      <w:r>
+        <w:t>Damit</w:t>
+      </w:r>
+      <w:proofErr w:type="spellEnd"/>
+      <w:r>
+        <w:t xml:space="preserve"> </w:t>
+      </w:r>
+      <w:proofErr w:type="spellStart"/>
+      <w:r>
+        <w:t>vermeiden</w:t>
+      </w:r>
+      <w:proofErr w:type="spellEnd"/>
+      <w:r>
+        <w:t xml:space="preserve"> </w:t>
+      </w:r>
+      <w:proofErr w:type="spellStart"/>
+      <w:r>
+        <w:t>wir</w:t>
+      </w:r>
+      <w:proofErr w:type="spellEnd"/>
+      <w:r>
+        <w:t xml:space="preserve"> </w:t>
+      </w:r>
+      <w:proofErr w:type="spellStart"/>
+      <w:r>
+        <w:t>doppelte</w:t>
+      </w:r>
+      <w:proofErr w:type="spellEnd"/>
+      <w:r>
+        <w:t xml:space="preserve"> </w:t>
+      </w:r>
+      <w:proofErr w:type="spellStart"/>
+      <w:r>
+        <w:t>Inhalte</w:t>
+      </w:r>
+      <w:proofErr w:type="spellEnd"/>
+      <w:r>
+        <w:t xml:space="preserve">, </w:t>
+      </w:r>
+      <w:proofErr w:type="spellStart"/>
+      <w:r>
+        <w:t>ungeprüfte</w:t>
+      </w:r>
+      <w:proofErr w:type="spellEnd"/>
+      <w:r>
+        <w:t xml:space="preserve"> </w:t>
+      </w:r>
+      <w:proofErr w:type="spellStart"/>
+      <w:r>
+        <w:t>Preise</w:t>
+      </w:r>
+      <w:proofErr w:type="spellEnd"/>
+      <w:r>
+        <w:t xml:space="preserve"> und </w:t>
+      </w:r>
+      <w:proofErr w:type="spellStart"/>
+      <w:r>
+        <w:t>fachliche</w:t>
+      </w:r>
+      <w:proofErr w:type="spellEnd"/>
+      <w:r>
+        <w:t xml:space="preserve"> </w:t>
+      </w:r>
+      <w:proofErr w:type="spellStart"/>
+      <w:r>
+        <w:t>Aussagen</w:t>
+      </w:r>
+      <w:proofErr w:type="spellEnd"/>
+      <w:r>
+        <w:t xml:space="preserve"> </w:t>
+      </w:r>
+      <w:proofErr w:type="spellStart"/>
+      <w:r>
+        <w:t>ohne</w:t>
+      </w:r>
+      <w:proofErr w:type="spellEnd"/>
+      <w:r>
+        <w:t xml:space="preserve"> </w:t>
+      </w:r>
+      <w:proofErr w:type="spellStart"/>
+      <w:r>
+        <w:t>klare</w:t>
+      </w:r>
+      <w:proofErr w:type="spellEnd"/>
+      <w:r>
+        <w:t xml:space="preserve"> </w:t>
+      </w:r>
+      <w:proofErr w:type="spellStart"/>
+      <w:r>
+        <w:t>Verantwortung</w:t>
+      </w:r>
+      <w:proofErr w:type="spellEnd"/>
+      <w:r>
+        <w:t>.</w:t>
       </w:r>
     </w:p>
     <w:p>
@@ -145,17 +445,171 @@
         <w:pStyle w:val="Textkrper"/>
       </w:pPr>
       <w:r>
-        <w:t xml:space="preserve">Noch offene Punkte dürfen ausdrücklich mit </w:t>
-      </w:r>
+        <w:t xml:space="preserve">Noch </w:t>
+      </w:r>
+      <w:proofErr w:type="spellStart"/>
+      <w:r>
+        <w:t>offene</w:t>
+      </w:r>
+      <w:proofErr w:type="spellEnd"/>
+      <w:r>
+        <w:t xml:space="preserve"> </w:t>
+      </w:r>
+      <w:proofErr w:type="spellStart"/>
+      <w:r>
+        <w:t>Punkte</w:t>
+      </w:r>
+      <w:proofErr w:type="spellEnd"/>
+      <w:r>
+        <w:t xml:space="preserve"> </w:t>
+      </w:r>
+      <w:proofErr w:type="spellStart"/>
+      <w:r>
+        <w:t>dürfen</w:t>
+      </w:r>
+      <w:proofErr w:type="spellEnd"/>
+      <w:r>
+        <w:t xml:space="preserve"> </w:t>
+      </w:r>
+      <w:proofErr w:type="spellStart"/>
+      <w:r>
+        <w:t>ausdrücklich</w:t>
+      </w:r>
+      <w:proofErr w:type="spellEnd"/>
+      <w:r>
+        <w:t xml:space="preserve"> </w:t>
+      </w:r>
+      <w:proofErr w:type="spellStart"/>
+      <w:r>
+        <w:t>mit</w:t>
+      </w:r>
+      <w:proofErr w:type="spellEnd"/>
+      <w:r>
+        <w:t xml:space="preserve"> </w:t>
+      </w:r>
+      <w:proofErr w:type="spellStart"/>
       <w:r>
         <w:rPr>
           <w:b/>
           <w:bCs/>
         </w:rPr>
-        <w:t>noch offen</w:t>
-      </w:r>
-      <w:r>
-        <w:t xml:space="preserve"> beantwortet werden. Sie werden dann als offene Freigabe geführt und nicht durch Annahmen ersetzt.</w:t>
+        <w:t>noch</w:t>
+      </w:r>
+      <w:proofErr w:type="spellEnd"/>
+      <w:r>
+        <w:rPr>
+          <w:b/>
+          <w:bCs/>
+        </w:rPr>
+        <w:t xml:space="preserve"> </w:t>
+      </w:r>
+      <w:proofErr w:type="spellStart"/>
+      <w:r>
+        <w:rPr>
+          <w:b/>
+          <w:bCs/>
+        </w:rPr>
+        <w:t>offen</w:t>
+      </w:r>
+      <w:proofErr w:type="spellEnd"/>
+      <w:r>
+        <w:t xml:space="preserve"> </w:t>
+      </w:r>
+      <w:proofErr w:type="spellStart"/>
+      <w:r>
+        <w:t>beantwortet</w:t>
+      </w:r>
+      <w:proofErr w:type="spellEnd"/>
+      <w:r>
+        <w:t xml:space="preserve"> </w:t>
+      </w:r>
+      <w:proofErr w:type="spellStart"/>
+      <w:r>
+        <w:t>werden</w:t>
+      </w:r>
+      <w:proofErr w:type="spellEnd"/>
+      <w:r>
+        <w:t xml:space="preserve">. Sie </w:t>
+      </w:r>
+      <w:proofErr w:type="spellStart"/>
+      <w:r>
+        <w:t>werden</w:t>
+      </w:r>
+      <w:proofErr w:type="spellEnd"/>
+      <w:r>
+        <w:t xml:space="preserve"> </w:t>
+      </w:r>
+      <w:proofErr w:type="spellStart"/>
+      <w:r>
+        <w:t>dann</w:t>
+      </w:r>
+      <w:proofErr w:type="spellEnd"/>
+      <w:r>
+        <w:t xml:space="preserve"> </w:t>
+      </w:r>
+      <w:proofErr w:type="spellStart"/>
+      <w:r>
+        <w:t>als</w:t>
+      </w:r>
+      <w:proofErr w:type="spellEnd"/>
+      <w:r>
+        <w:t xml:space="preserve"> </w:t>
+      </w:r>
+      <w:proofErr w:type="spellStart"/>
+      <w:r>
+        <w:t>offene</w:t>
+      </w:r>
+      <w:proofErr w:type="spellEnd"/>
+      <w:r>
+        <w:t xml:space="preserve"> </w:t>
+      </w:r>
+      <w:proofErr w:type="spellStart"/>
+      <w:r>
+        <w:t>Freigabe</w:t>
+      </w:r>
+      <w:proofErr w:type="spellEnd"/>
+      <w:r>
+        <w:t xml:space="preserve"> </w:t>
+      </w:r>
+      <w:proofErr w:type="spellStart"/>
+      <w:r>
+        <w:t>geführt</w:t>
+      </w:r>
+      <w:proofErr w:type="spellEnd"/>
+      <w:r>
+        <w:t xml:space="preserve"> und </w:t>
+      </w:r>
+      <w:proofErr w:type="spellStart"/>
+      <w:r>
+        <w:t>nicht</w:t>
+      </w:r>
+      <w:proofErr w:type="spellEnd"/>
+      <w:r>
+        <w:t xml:space="preserve"> </w:t>
+      </w:r>
+      <w:proofErr w:type="spellStart"/>
+      <w:r>
+        <w:t>durch</w:t>
+      </w:r>
+      <w:proofErr w:type="spellEnd"/>
+      <w:r>
+        <w:t xml:space="preserve"> </w:t>
+      </w:r>
+      <w:proofErr w:type="spellStart"/>
+      <w:r>
+        <w:t>Annahmen</w:t>
+      </w:r>
+      <w:proofErr w:type="spellEnd"/>
+      <w:r>
+        <w:t xml:space="preserve"> </w:t>
+      </w:r>
+      <w:proofErr w:type="spellStart"/>
+      <w:r>
+        <w:t>ersetzt</w:t>
+      </w:r>
+      <w:proofErr w:type="spellEnd"/>
+      <w:r>
+        <w:t>.</w:t>
       </w:r>
     </w:p>
     <w:p>
@@ -164,9 +618,11 @@
       </w:pPr>
       <w:bookmarkStart w:id="3" w:name="entscheidungen"/>
       <w:bookmarkEnd w:id="2"/>
+      <w:proofErr w:type="spellStart"/>
       <w:r>
         <w:t>Entscheidungen</w:t>
       </w:r>
+      <w:proofErr w:type="spellEnd"/>
     </w:p>
     <w:p>
       <w:pPr>
@@ -174,8 +630,21 @@
       </w:pPr>
       <w:bookmarkStart w:id="4" w:name="cp-01-gewichtung-der-startseite"/>
       <w:r>
-        <w:t>CP-01: Gewichtung der Startseite</w:t>
-      </w:r>
+        <w:t xml:space="preserve">CP-01: </w:t>
+      </w:r>
+      <w:proofErr w:type="spellStart"/>
+      <w:r>
+        <w:t>Gewichtung</w:t>
+      </w:r>
+      <w:proofErr w:type="spellEnd"/>
+      <w:r>
+        <w:t xml:space="preserve"> der </w:t>
+      </w:r>
+      <w:proofErr w:type="spellStart"/>
+      <w:r>
+        <w:t>Startseite</w:t>
+      </w:r>
+      <w:proofErr w:type="spellEnd"/>
     </w:p>
     <w:p>
       <w:pPr>
@@ -189,46 +658,242 @@
         <w:t>Frage:</w:t>
       </w:r>
       <w:r>
-        <w:t xml:space="preserve"> Soll die Startseite Unternehmen zuerst ansprechen und Privatpersonen klar zu Mindforge führen?</w:t>
+        <w:t xml:space="preserve"> Soll die </w:t>
+      </w:r>
+      <w:proofErr w:type="spellStart"/>
+      <w:r>
+        <w:t>Startseite</w:t>
+      </w:r>
+      <w:proofErr w:type="spellEnd"/>
+      <w:r>
+        <w:t xml:space="preserve"> </w:t>
+      </w:r>
+      <w:proofErr w:type="spellStart"/>
+      <w:r>
+        <w:t>Unternehmen</w:t>
+      </w:r>
+      <w:proofErr w:type="spellEnd"/>
+      <w:r>
+        <w:t xml:space="preserve"> </w:t>
+      </w:r>
+      <w:proofErr w:type="spellStart"/>
+      <w:r>
+        <w:t>zuerst</w:t>
+      </w:r>
+      <w:proofErr w:type="spellEnd"/>
+      <w:r>
+        <w:t xml:space="preserve"> </w:t>
+      </w:r>
+      <w:proofErr w:type="spellStart"/>
+      <w:r>
+        <w:t>ansprechen</w:t>
+      </w:r>
+      <w:proofErr w:type="spellEnd"/>
+      <w:r>
+        <w:t xml:space="preserve"> und </w:t>
+      </w:r>
+      <w:proofErr w:type="spellStart"/>
+      <w:r>
+        <w:t>Privatpersonen</w:t>
+      </w:r>
+      <w:proofErr w:type="spellEnd"/>
+      <w:r>
+        <w:t xml:space="preserve"> </w:t>
+      </w:r>
+      <w:proofErr w:type="spellStart"/>
+      <w:r>
+        <w:t>klar</w:t>
+      </w:r>
+      <w:proofErr w:type="spellEnd"/>
+      <w:r>
+        <w:t xml:space="preserve"> </w:t>
+      </w:r>
+      <w:proofErr w:type="spellStart"/>
+      <w:r>
+        <w:t>zu</w:t>
+      </w:r>
+      <w:proofErr w:type="spellEnd"/>
+      <w:r>
+        <w:t xml:space="preserve"> </w:t>
+      </w:r>
+      <w:proofErr w:type="spellStart"/>
+      <w:r>
+        <w:t>Mindforge</w:t>
+      </w:r>
+      <w:proofErr w:type="spellEnd"/>
+      <w:r>
+        <w:t xml:space="preserve"> </w:t>
+      </w:r>
+      <w:proofErr w:type="spellStart"/>
+      <w:r>
+        <w:t>führen</w:t>
+      </w:r>
+      <w:proofErr w:type="spellEnd"/>
+      <w:r>
+        <w:t>?</w:t>
       </w:r>
     </w:p>
     <w:p>
       <w:pPr>
         <w:pStyle w:val="Textkrper"/>
       </w:pPr>
+      <w:proofErr w:type="spellStart"/>
       <w:r>
         <w:rPr>
           <w:b/>
           <w:bCs/>
         </w:rPr>
-        <w:t>Empfehlung:</w:t>
-      </w:r>
-      <w:r>
-        <w:t xml:space="preserve"> Ja. Beide Wege bleiben sichtbar, Unternehmen bilden jedoch die primäre Hierarchie.</w:t>
-      </w:r>
-    </w:p>
-    <w:p>
-      <w:pPr>
-        <w:pStyle w:val="Textkrper"/>
-      </w:pPr>
+        <w:t>Empfehlung</w:t>
+      </w:r>
+      <w:proofErr w:type="spellEnd"/>
       <w:r>
         <w:rPr>
           <w:b/>
           <w:bCs/>
         </w:rPr>
-        <w:t>Antwort:</w:t>
+        <w:t>:</w:t>
+      </w:r>
+      <w:r>
+        <w:t xml:space="preserve"> Ja. </w:t>
+      </w:r>
+      <w:proofErr w:type="spellStart"/>
+      <w:r>
+        <w:t>Beide</w:t>
+      </w:r>
+      <w:proofErr w:type="spellEnd"/>
+      <w:r>
+        <w:t xml:space="preserve"> </w:t>
+      </w:r>
+      <w:proofErr w:type="spellStart"/>
+      <w:r>
+        <w:t>Wege</w:t>
+      </w:r>
+      <w:proofErr w:type="spellEnd"/>
+      <w:r>
+        <w:t xml:space="preserve"> </w:t>
+      </w:r>
+      <w:proofErr w:type="spellStart"/>
+      <w:r>
+        <w:t>bleiben</w:t>
+      </w:r>
+      <w:proofErr w:type="spellEnd"/>
+      <w:r>
+        <w:t xml:space="preserve"> </w:t>
+      </w:r>
+      <w:proofErr w:type="spellStart"/>
+      <w:r>
+        <w:t>sichtbar</w:t>
+      </w:r>
+      <w:proofErr w:type="spellEnd"/>
+      <w:r>
+        <w:t xml:space="preserve">, </w:t>
+      </w:r>
+      <w:proofErr w:type="spellStart"/>
+      <w:r>
+        <w:t>Unternehmen</w:t>
+      </w:r>
+      <w:proofErr w:type="spellEnd"/>
+      <w:r>
+        <w:t xml:space="preserve"> </w:t>
+      </w:r>
+      <w:proofErr w:type="spellStart"/>
+      <w:r>
+        <w:t>bilden</w:t>
+      </w:r>
+      <w:proofErr w:type="spellEnd"/>
+      <w:r>
+        <w:t xml:space="preserve"> </w:t>
+      </w:r>
+      <w:proofErr w:type="spellStart"/>
+      <w:r>
+        <w:t>jedoch</w:t>
+      </w:r>
+      <w:proofErr w:type="spellEnd"/>
+      <w:r>
+        <w:t xml:space="preserve"> die </w:t>
+      </w:r>
+      <w:proofErr w:type="spellStart"/>
+      <w:r>
+        <w:t>primäre</w:t>
+      </w:r>
+      <w:proofErr w:type="spellEnd"/>
+      <w:r>
+        <w:t xml:space="preserve"> </w:t>
+      </w:r>
+      <w:proofErr w:type="spellStart"/>
+      <w:r>
+        <w:t>Hierarchie</w:t>
+      </w:r>
+      <w:proofErr w:type="spellEnd"/>
+      <w:r>
+        <w:t>.</w:t>
       </w:r>
     </w:p>
     <w:p>
       <w:pPr>
         <w:pStyle w:val="Textkrper"/>
       </w:pPr>
-      <w:r>
-        <w:t>[ ] Freigegeben</w:t>
-      </w:r>
+      <w:proofErr w:type="spellStart"/>
+      <w:r>
+        <w:rPr>
+          <w:b/>
+          <w:bCs/>
+        </w:rPr>
+        <w:t>Antwort</w:t>
+      </w:r>
+      <w:proofErr w:type="spellEnd"/>
+      <w:r>
+        <w:rPr>
+          <w:b/>
+          <w:bCs/>
+        </w:rPr>
+        <w:t>:</w:t>
+      </w:r>
+    </w:p>
+    <w:p>
+      <w:pPr>
+        <w:pStyle w:val="Textkrper"/>
+      </w:pPr>
+      <w:r>
+        <w:t xml:space="preserve"> </w:t>
+      </w:r>
+      <w:r>
+        <w:t>x</w:t>
+      </w:r>
+      <w:r>
+        <w:t xml:space="preserve">] </w:t>
+      </w:r>
+      <w:proofErr w:type="spellStart"/>
+      <w:r>
+        <w:t>Freigegeben</w:t>
+      </w:r>
+      <w:proofErr w:type="spellEnd"/>
       <w:r>
         <w:br/>
-        <w:t>[ ] Änderung gewünscht: _________________________________________________</w:t>
+      </w:r>
+      <w:proofErr w:type="gramStart"/>
+      <w:r>
+        <w:t>[ ]</w:t>
+      </w:r>
+      <w:proofErr w:type="gramEnd"/>
+      <w:r>
+        <w:t xml:space="preserve"> </w:t>
+      </w:r>
+      <w:proofErr w:type="spellStart"/>
+      <w:r>
+        <w:t>Änderung</w:t>
+      </w:r>
+      <w:proofErr w:type="spellEnd"/>
+      <w:r>
+        <w:t xml:space="preserve"> </w:t>
+      </w:r>
+      <w:proofErr w:type="spellStart"/>
+      <w:r>
+        <w:t>gewünscht</w:t>
+      </w:r>
+      <w:proofErr w:type="spellEnd"/>
+      <w:r>
+        <w:t>: _________________________________________________</w:t>
       </w:r>
     </w:p>
     <w:p>
@@ -238,8 +903,21 @@
       <w:bookmarkStart w:id="5" w:name="cp-02-verantwortung-je-seite"/>
       <w:bookmarkEnd w:id="4"/>
       <w:r>
-        <w:t>CP-02: Verantwortung je Seite</w:t>
-      </w:r>
+        <w:t xml:space="preserve">CP-02: </w:t>
+      </w:r>
+      <w:proofErr w:type="spellStart"/>
+      <w:r>
+        <w:t>Verantwortung</w:t>
+      </w:r>
+      <w:proofErr w:type="spellEnd"/>
+      <w:r>
+        <w:t xml:space="preserve"> je </w:t>
+      </w:r>
+      <w:proofErr w:type="spellStart"/>
+      <w:r>
+        <w:t>Seite</w:t>
+      </w:r>
+      <w:proofErr w:type="spellEnd"/>
     </w:p>
     <w:p>
       <w:pPr>
@@ -253,34 +931,220 @@
         <w:t>Frage:</w:t>
       </w:r>
       <w:r>
-        <w:t xml:space="preserve"> Wer ist für Inhalt und fachliche Prüfung der einzelnen Seiten verantwortlich?</w:t>
+        <w:t xml:space="preserve"> </w:t>
+      </w:r>
+      <w:proofErr w:type="spellStart"/>
+      <w:r>
+        <w:t>Wer</w:t>
+      </w:r>
+      <w:proofErr w:type="spellEnd"/>
+      <w:r>
+        <w:t xml:space="preserve"> </w:t>
+      </w:r>
+      <w:proofErr w:type="spellStart"/>
+      <w:r>
+        <w:t>ist</w:t>
+      </w:r>
+      <w:proofErr w:type="spellEnd"/>
+      <w:r>
+        <w:t xml:space="preserve"> für </w:t>
+      </w:r>
+      <w:proofErr w:type="spellStart"/>
+      <w:r>
+        <w:t>Inhalt</w:t>
+      </w:r>
+      <w:proofErr w:type="spellEnd"/>
+      <w:r>
+        <w:t xml:space="preserve"> und </w:t>
+      </w:r>
+      <w:proofErr w:type="spellStart"/>
+      <w:r>
+        <w:t>fachliche</w:t>
+      </w:r>
+      <w:proofErr w:type="spellEnd"/>
+      <w:r>
+        <w:t xml:space="preserve"> </w:t>
+      </w:r>
+      <w:proofErr w:type="spellStart"/>
+      <w:r>
+        <w:t>Prüfung</w:t>
+      </w:r>
+      <w:proofErr w:type="spellEnd"/>
+      <w:r>
+        <w:t xml:space="preserve"> der </w:t>
+      </w:r>
+      <w:proofErr w:type="spellStart"/>
+      <w:r>
+        <w:t>einzelnen</w:t>
+      </w:r>
+      <w:proofErr w:type="spellEnd"/>
+      <w:r>
+        <w:t xml:space="preserve"> Seiten </w:t>
+      </w:r>
+      <w:proofErr w:type="spellStart"/>
+      <w:r>
+        <w:t>verantwortlich</w:t>
+      </w:r>
+      <w:proofErr w:type="spellEnd"/>
+      <w:r>
+        <w:t>?</w:t>
       </w:r>
     </w:p>
     <w:p>
       <w:pPr>
         <w:pStyle w:val="Textkrper"/>
       </w:pPr>
+      <w:proofErr w:type="spellStart"/>
       <w:r>
         <w:rPr>
           <w:b/>
           <w:bCs/>
         </w:rPr>
-        <w:t>Empfehlung:</w:t>
-      </w:r>
-      <w:r>
-        <w:t xml:space="preserve"> Pro Seite werden eine redaktionell verantwortliche und eine fachlich prüfende Person benannt. Beide Rollen dürfen bei derselben Person liegen.</w:t>
-      </w:r>
-    </w:p>
-    <w:p>
-      <w:pPr>
-        <w:pStyle w:val="Textkrper"/>
-      </w:pPr>
+        <w:t>Empfehlung</w:t>
+      </w:r>
+      <w:proofErr w:type="spellEnd"/>
       <w:r>
         <w:rPr>
           <w:b/>
           <w:bCs/>
         </w:rPr>
-        <w:t>Antwort:</w:t>
+        <w:t>:</w:t>
+      </w:r>
+      <w:r>
+        <w:t xml:space="preserve"> Pro </w:t>
+      </w:r>
+      <w:proofErr w:type="spellStart"/>
+      <w:r>
+        <w:t>Seite</w:t>
+      </w:r>
+      <w:proofErr w:type="spellEnd"/>
+      <w:r>
+        <w:t xml:space="preserve"> </w:t>
+      </w:r>
+      <w:proofErr w:type="spellStart"/>
+      <w:r>
+        <w:t>werden</w:t>
+      </w:r>
+      <w:proofErr w:type="spellEnd"/>
+      <w:r>
+        <w:t xml:space="preserve"> </w:t>
+      </w:r>
+      <w:proofErr w:type="spellStart"/>
+      <w:r>
+        <w:t>eine</w:t>
+      </w:r>
+      <w:proofErr w:type="spellEnd"/>
+      <w:r>
+        <w:t xml:space="preserve"> </w:t>
+      </w:r>
+      <w:proofErr w:type="spellStart"/>
+      <w:r>
+        <w:t>redaktionell</w:t>
+      </w:r>
+      <w:proofErr w:type="spellEnd"/>
+      <w:r>
+        <w:t xml:space="preserve"> </w:t>
+      </w:r>
+      <w:proofErr w:type="spellStart"/>
+      <w:r>
+        <w:t>verantwortliche</w:t>
+      </w:r>
+      <w:proofErr w:type="spellEnd"/>
+      <w:r>
+        <w:t xml:space="preserve"> und </w:t>
+      </w:r>
+      <w:proofErr w:type="spellStart"/>
+      <w:r>
+        <w:t>eine</w:t>
+      </w:r>
+      <w:proofErr w:type="spellEnd"/>
+      <w:r>
+        <w:t xml:space="preserve"> </w:t>
+      </w:r>
+      <w:proofErr w:type="spellStart"/>
+      <w:r>
+        <w:t>fachlich</w:t>
+      </w:r>
+      <w:proofErr w:type="spellEnd"/>
+      <w:r>
+        <w:t xml:space="preserve"> </w:t>
+      </w:r>
+      <w:proofErr w:type="spellStart"/>
+      <w:r>
+        <w:t>prüfende</w:t>
+      </w:r>
+      <w:proofErr w:type="spellEnd"/>
+      <w:r>
+        <w:t xml:space="preserve"> Person </w:t>
+      </w:r>
+      <w:proofErr w:type="spellStart"/>
+      <w:r>
+        <w:t>benannt</w:t>
+      </w:r>
+      <w:proofErr w:type="spellEnd"/>
+      <w:r>
+        <w:t xml:space="preserve">. </w:t>
+      </w:r>
+      <w:proofErr w:type="spellStart"/>
+      <w:r>
+        <w:t>Beide</w:t>
+      </w:r>
+      <w:proofErr w:type="spellEnd"/>
+      <w:r>
+        <w:t xml:space="preserve"> Rollen </w:t>
+      </w:r>
+      <w:proofErr w:type="spellStart"/>
+      <w:r>
+        <w:t>dürfen</w:t>
+      </w:r>
+      <w:proofErr w:type="spellEnd"/>
+      <w:r>
+        <w:t xml:space="preserve"> </w:t>
+      </w:r>
+      <w:proofErr w:type="spellStart"/>
+      <w:r>
+        <w:t>bei</w:t>
+      </w:r>
+      <w:proofErr w:type="spellEnd"/>
+      <w:r>
+        <w:t xml:space="preserve"> </w:t>
+      </w:r>
+      <w:proofErr w:type="spellStart"/>
+      <w:r>
+        <w:t>derselben</w:t>
+      </w:r>
+      <w:proofErr w:type="spellEnd"/>
+      <w:r>
+        <w:t xml:space="preserve"> Person </w:t>
+      </w:r>
+      <w:proofErr w:type="spellStart"/>
+      <w:r>
+        <w:t>liegen</w:t>
+      </w:r>
+      <w:proofErr w:type="spellEnd"/>
+      <w:r>
+        <w:t>.</w:t>
+      </w:r>
+    </w:p>
+    <w:p>
+      <w:pPr>
+        <w:pStyle w:val="Textkrper"/>
+      </w:pPr>
+      <w:proofErr w:type="spellStart"/>
+      <w:r>
+        <w:rPr>
+          <w:b/>
+          <w:bCs/>
+        </w:rPr>
+        <w:t>Antwort</w:t>
+      </w:r>
+      <w:proofErr w:type="spellEnd"/>
+      <w:r>
+        <w:rPr>
+          <w:b/>
+          <w:bCs/>
+        </w:rPr>
+        <w:t>:</w:t>
       </w:r>
     </w:p>
     <w:p>
@@ -291,8 +1155,13 @@
           <w:numId w:val="3"/>
         </w:numPr>
       </w:pPr>
-      <w:r>
-        <w:t>Startseite: ____________________________________________________________</w:t>
+      <w:proofErr w:type="spellStart"/>
+      <w:r>
+        <w:t>Startseite</w:t>
+      </w:r>
+      <w:proofErr w:type="spellEnd"/>
+      <w:r>
+        <w:t>: ____________________________________________________________</w:t>
       </w:r>
     </w:p>
     <w:p>
@@ -303,8 +1172,13 @@
           <w:numId w:val="3"/>
         </w:numPr>
       </w:pPr>
-      <w:r>
-        <w:t>Unternehmen: __________________________________________________________</w:t>
+      <w:proofErr w:type="spellStart"/>
+      <w:r>
+        <w:t>Unternehmen</w:t>
+      </w:r>
+      <w:proofErr w:type="spellEnd"/>
+      <w:r>
+        <w:t>: __________________________________________________________</w:t>
       </w:r>
     </w:p>
     <w:p>
@@ -315,8 +1189,13 @@
           <w:numId w:val="3"/>
         </w:numPr>
       </w:pPr>
-      <w:r>
-        <w:t>Leistungen: ___________________________________________________________</w:t>
+      <w:proofErr w:type="spellStart"/>
+      <w:r>
+        <w:t>Leistungen</w:t>
+      </w:r>
+      <w:proofErr w:type="spellEnd"/>
+      <w:r>
+        <w:t>: ___________________________________________________________</w:t>
       </w:r>
     </w:p>
     <w:p>
@@ -327,8 +1206,13 @@
           <w:numId w:val="3"/>
         </w:numPr>
       </w:pPr>
-      <w:r>
-        <w:t>Businesscoaching: _____________________________________________________</w:t>
+      <w:proofErr w:type="spellStart"/>
+      <w:r>
+        <w:t>Businesscoaching</w:t>
+      </w:r>
+      <w:proofErr w:type="spellEnd"/>
+      <w:r>
+        <w:t>: _____________________________________________________</w:t>
       </w:r>
     </w:p>
     <w:p>
@@ -339,8 +1223,13 @@
           <w:numId w:val="3"/>
         </w:numPr>
       </w:pPr>
-      <w:r>
-        <w:t>Mindforge: _____________________________________________________________</w:t>
+      <w:proofErr w:type="spellStart"/>
+      <w:r>
+        <w:t>Mindforge</w:t>
+      </w:r>
+      <w:proofErr w:type="spellEnd"/>
+      <w:r>
+        <w:t>: _____________________________________________________________</w:t>
       </w:r>
     </w:p>
     <w:p>
@@ -351,8 +1240,58 @@
           <w:numId w:val="3"/>
         </w:numPr>
       </w:pPr>
-      <w:r>
-        <w:t>Gewünschter Prüfturnus: _______________________________________________</w:t>
+      <w:proofErr w:type="spellStart"/>
+      <w:r>
+        <w:t>Gewünschter</w:t>
+      </w:r>
+      <w:proofErr w:type="spellEnd"/>
+      <w:r>
+        <w:t xml:space="preserve"> </w:t>
+      </w:r>
+      <w:proofErr w:type="spellStart"/>
+      <w:r>
+        <w:t>Prüfturnus</w:t>
+      </w:r>
+      <w:proofErr w:type="spellEnd"/>
+      <w:r>
+        <w:t>: _______________________________________________</w:t>
+      </w:r>
+    </w:p>
+    <w:p>
+      <w:pPr>
+        <w:pStyle w:val="Compact"/>
+      </w:pPr>
+    </w:p>
+    <w:p>
+      <w:pPr>
+        <w:pStyle w:val="Compact"/>
+      </w:pPr>
+      <w:r>
+        <w:t xml:space="preserve">Bei </w:t>
+      </w:r>
+      <w:proofErr w:type="spellStart"/>
+      <w:r>
+        <w:t>allem</w:t>
+      </w:r>
+      <w:proofErr w:type="spellEnd"/>
+      <w:r>
+        <w:t xml:space="preserve"> </w:t>
+      </w:r>
+      <w:proofErr w:type="spellStart"/>
+      <w:r>
+        <w:t>wir</w:t>
+      </w:r>
+      <w:proofErr w:type="spellEnd"/>
+      <w:r>
+        <w:t xml:space="preserve"> </w:t>
+      </w:r>
+      <w:proofErr w:type="spellStart"/>
+      <w:r>
+        <w:t>beide</w:t>
+      </w:r>
+      <w:proofErr w:type="spellEnd"/>
+      <w:r>
+        <w:t xml:space="preserve"> </w:t>
       </w:r>
     </w:p>
     <w:p>
@@ -366,8 +1305,21 @@
       </w:r>
       <w:r>
         <w:lastRenderedPageBreak/>
-        <w:t>CP-03: Verbindliche Leistungsbegriffe</w:t>
-      </w:r>
+        <w:t xml:space="preserve">CP-03: </w:t>
+      </w:r>
+      <w:proofErr w:type="spellStart"/>
+      <w:r>
+        <w:t>Verbindliche</w:t>
+      </w:r>
+      <w:proofErr w:type="spellEnd"/>
+      <w:r>
+        <w:t xml:space="preserve"> </w:t>
+      </w:r>
+      <w:proofErr w:type="spellStart"/>
+      <w:r>
+        <w:t>Leistungsbegriffe</w:t>
+      </w:r>
+      <w:proofErr w:type="spellEnd"/>
     </w:p>
     <w:p>
       <w:pPr>
@@ -381,7 +1333,63 @@
         <w:t>Frage:</w:t>
       </w:r>
       <w:r>
-        <w:t xml:space="preserve"> Welche Begriffe und Abgrenzungen sollen verbindlich verwendet werden?</w:t>
+        <w:t xml:space="preserve"> </w:t>
+      </w:r>
+      <w:proofErr w:type="spellStart"/>
+      <w:r>
+        <w:t>Welche</w:t>
+      </w:r>
+      <w:proofErr w:type="spellEnd"/>
+      <w:r>
+        <w:t xml:space="preserve"> </w:t>
+      </w:r>
+      <w:proofErr w:type="spellStart"/>
+      <w:r>
+        <w:t>Begriffe</w:t>
+      </w:r>
+      <w:proofErr w:type="spellEnd"/>
+      <w:r>
+        <w:t xml:space="preserve"> und </w:t>
+      </w:r>
+      <w:proofErr w:type="spellStart"/>
+      <w:r>
+        <w:t>Abgrenzungen</w:t>
+      </w:r>
+      <w:proofErr w:type="spellEnd"/>
+      <w:r>
+        <w:t xml:space="preserve"> </w:t>
+      </w:r>
+      <w:proofErr w:type="spellStart"/>
+      <w:r>
+        <w:t>sollen</w:t>
+      </w:r>
+      <w:proofErr w:type="spellEnd"/>
+      <w:r>
+        <w:t xml:space="preserve"> </w:t>
+      </w:r>
+      <w:proofErr w:type="spellStart"/>
+      <w:r>
+        <w:t>verbindlich</w:t>
+      </w:r>
+      <w:proofErr w:type="spellEnd"/>
+      <w:r>
+        <w:t xml:space="preserve"> </w:t>
+      </w:r>
+      <w:proofErr w:type="spellStart"/>
+      <w:r>
+        <w:t>verwendet</w:t>
+      </w:r>
+      <w:proofErr w:type="spellEnd"/>
+      <w:r>
+        <w:t xml:space="preserve"> </w:t>
+      </w:r>
+      <w:proofErr w:type="spellStart"/>
+      <w:r>
+        <w:t>werden</w:t>
+      </w:r>
+      <w:proofErr w:type="spellEnd"/>
+      <w:r>
+        <w:t>?</w:t>
       </w:r>
     </w:p>
     <w:p>
@@ -389,46 +1397,264 @@
         <w:pStyle w:val="Textkrper"/>
       </w:pPr>
       <w:r>
-        <w:t>Zu klären sind insbesondere Coaching, Beratung, Businesscoaching, Mindforge, Mediation, Supervision, Recruiting, Assessment Center sowie Workshops und Vorträge.</w:t>
+        <w:t xml:space="preserve">Zu </w:t>
+      </w:r>
+      <w:proofErr w:type="spellStart"/>
+      <w:r>
+        <w:t>klären</w:t>
+      </w:r>
+      <w:proofErr w:type="spellEnd"/>
+      <w:r>
+        <w:t xml:space="preserve"> </w:t>
+      </w:r>
+      <w:proofErr w:type="spellStart"/>
+      <w:r>
+        <w:t>sind</w:t>
+      </w:r>
+      <w:proofErr w:type="spellEnd"/>
+      <w:r>
+        <w:t xml:space="preserve"> </w:t>
+      </w:r>
+      <w:proofErr w:type="spellStart"/>
+      <w:r>
+        <w:t>insbesondere</w:t>
+      </w:r>
+      <w:proofErr w:type="spellEnd"/>
+      <w:r>
+        <w:t xml:space="preserve"> Coaching, </w:t>
+      </w:r>
+      <w:proofErr w:type="spellStart"/>
+      <w:r>
+        <w:t>Beratung</w:t>
+      </w:r>
+      <w:proofErr w:type="spellEnd"/>
+      <w:r>
+        <w:t xml:space="preserve">, </w:t>
+      </w:r>
+      <w:proofErr w:type="spellStart"/>
+      <w:r>
+        <w:t>Businesscoaching</w:t>
+      </w:r>
+      <w:proofErr w:type="spellEnd"/>
+      <w:r>
+        <w:t xml:space="preserve">, </w:t>
+      </w:r>
+      <w:proofErr w:type="spellStart"/>
+      <w:r>
+        <w:t>Mindforge</w:t>
+      </w:r>
+      <w:proofErr w:type="spellEnd"/>
+      <w:r>
+        <w:t xml:space="preserve">, Mediation, Supervision, Recruiting, Assessment Center </w:t>
+      </w:r>
+      <w:proofErr w:type="spellStart"/>
+      <w:r>
+        <w:t>sowie</w:t>
+      </w:r>
+      <w:proofErr w:type="spellEnd"/>
+      <w:r>
+        <w:t xml:space="preserve"> Workshops und </w:t>
+      </w:r>
+      <w:proofErr w:type="spellStart"/>
+      <w:r>
+        <w:t>Vorträge</w:t>
+      </w:r>
+      <w:proofErr w:type="spellEnd"/>
+      <w:r>
+        <w:t>.</w:t>
       </w:r>
     </w:p>
     <w:p>
       <w:pPr>
         <w:pStyle w:val="Textkrper"/>
       </w:pPr>
+      <w:proofErr w:type="spellStart"/>
       <w:r>
         <w:rPr>
           <w:b/>
           <w:bCs/>
         </w:rPr>
-        <w:t>Empfehlung:</w:t>
-      </w:r>
-      <w:r>
-        <w:t xml:space="preserve"> Eine gemeinsame Begriffsliste festlegen und jede Leistung genau einer führenden Seite zuordnen.</w:t>
-      </w:r>
-    </w:p>
-    <w:p>
-      <w:pPr>
-        <w:pStyle w:val="Textkrper"/>
-      </w:pPr>
+        <w:t>Empfehlung</w:t>
+      </w:r>
+      <w:proofErr w:type="spellEnd"/>
       <w:r>
         <w:rPr>
           <w:b/>
           <w:bCs/>
         </w:rPr>
-        <w:t>Antwort:</w:t>
+        <w:t>:</w:t>
+      </w:r>
+      <w:r>
+        <w:t xml:space="preserve"> Eine </w:t>
+      </w:r>
+      <w:proofErr w:type="spellStart"/>
+      <w:r>
+        <w:t>gemeinsame</w:t>
+      </w:r>
+      <w:proofErr w:type="spellEnd"/>
+      <w:r>
+        <w:t xml:space="preserve"> </w:t>
+      </w:r>
+      <w:proofErr w:type="spellStart"/>
+      <w:r>
+        <w:t>Begriffsliste</w:t>
+      </w:r>
+      <w:proofErr w:type="spellEnd"/>
+      <w:r>
+        <w:t xml:space="preserve"> </w:t>
+      </w:r>
+      <w:proofErr w:type="spellStart"/>
+      <w:r>
+        <w:t>festlegen</w:t>
+      </w:r>
+      <w:proofErr w:type="spellEnd"/>
+      <w:r>
+        <w:t xml:space="preserve"> und </w:t>
+      </w:r>
+      <w:proofErr w:type="spellStart"/>
+      <w:r>
+        <w:t>jede</w:t>
+      </w:r>
+      <w:proofErr w:type="spellEnd"/>
+      <w:r>
+        <w:t xml:space="preserve"> </w:t>
+      </w:r>
+      <w:proofErr w:type="spellStart"/>
+      <w:r>
+        <w:t>Leistung</w:t>
+      </w:r>
+      <w:proofErr w:type="spellEnd"/>
+      <w:r>
+        <w:t xml:space="preserve"> </w:t>
+      </w:r>
+      <w:proofErr w:type="spellStart"/>
+      <w:r>
+        <w:t>genau</w:t>
+      </w:r>
+      <w:proofErr w:type="spellEnd"/>
+      <w:r>
+        <w:t xml:space="preserve"> </w:t>
+      </w:r>
+      <w:proofErr w:type="spellStart"/>
+      <w:r>
+        <w:t>einer</w:t>
+      </w:r>
+      <w:proofErr w:type="spellEnd"/>
+      <w:r>
+        <w:t xml:space="preserve"> </w:t>
+      </w:r>
+      <w:proofErr w:type="spellStart"/>
+      <w:r>
+        <w:t>führenden</w:t>
+      </w:r>
+      <w:proofErr w:type="spellEnd"/>
+      <w:r>
+        <w:t xml:space="preserve"> </w:t>
+      </w:r>
+      <w:proofErr w:type="spellStart"/>
+      <w:r>
+        <w:t>Seite</w:t>
+      </w:r>
+      <w:proofErr w:type="spellEnd"/>
+      <w:r>
+        <w:t xml:space="preserve"> </w:t>
+      </w:r>
+      <w:proofErr w:type="spellStart"/>
+      <w:r>
+        <w:t>zuordnen</w:t>
+      </w:r>
+      <w:proofErr w:type="spellEnd"/>
+      <w:r>
+        <w:t>.</w:t>
       </w:r>
     </w:p>
     <w:p>
       <w:pPr>
         <w:pStyle w:val="Textkrper"/>
       </w:pPr>
-      <w:r>
-        <w:t>[ ] Begriffe und Abgrenzung freigegeben</w:t>
-      </w:r>
+      <w:proofErr w:type="spellStart"/>
+      <w:r>
+        <w:rPr>
+          <w:b/>
+          <w:bCs/>
+        </w:rPr>
+        <w:t>Antwort</w:t>
+      </w:r>
+      <w:proofErr w:type="spellEnd"/>
+      <w:r>
+        <w:rPr>
+          <w:b/>
+          <w:bCs/>
+        </w:rPr>
+        <w:t>:</w:t>
+      </w:r>
+    </w:p>
+    <w:p>
+      <w:pPr>
+        <w:pStyle w:val="Textkrper"/>
+      </w:pPr>
+      <w:r>
+        <w:t>[</w:t>
+      </w:r>
+      <w:proofErr w:type="gramStart"/>
+      <w:r>
+        <w:t>x</w:t>
+      </w:r>
+      <w:r>
+        <w:t xml:space="preserve"> ]</w:t>
+      </w:r>
+      <w:proofErr w:type="gramEnd"/>
+      <w:r>
+        <w:t xml:space="preserve"> </w:t>
+      </w:r>
+      <w:proofErr w:type="spellStart"/>
+      <w:r>
+        <w:t>Begriffe</w:t>
+      </w:r>
+      <w:proofErr w:type="spellEnd"/>
+      <w:r>
+        <w:t xml:space="preserve"> und </w:t>
+      </w:r>
+      <w:proofErr w:type="spellStart"/>
+      <w:r>
+        <w:t>Abgrenzung</w:t>
+      </w:r>
+      <w:proofErr w:type="spellEnd"/>
+      <w:r>
+        <w:t xml:space="preserve"> </w:t>
+      </w:r>
+      <w:proofErr w:type="spellStart"/>
+      <w:r>
+        <w:t>freigegeben</w:t>
+      </w:r>
+      <w:proofErr w:type="spellEnd"/>
       <w:r>
         <w:br/>
-        <w:t>[ ] Änderungen oder Rückstellungen: _____________________________________</w:t>
+        <w:t xml:space="preserve">[ ] </w:t>
+      </w:r>
+      <w:proofErr w:type="spellStart"/>
+      <w:r>
+        <w:t>Änderungen</w:t>
+      </w:r>
+      <w:proofErr w:type="spellEnd"/>
+      <w:r>
+        <w:t xml:space="preserve"> </w:t>
+      </w:r>
+      <w:proofErr w:type="spellStart"/>
+      <w:r>
+        <w:t>oder</w:t>
+      </w:r>
+      <w:proofErr w:type="spellEnd"/>
+      <w:r>
+        <w:t xml:space="preserve"> </w:t>
+      </w:r>
+      <w:proofErr w:type="spellStart"/>
+      <w:r>
+        <w:t>Rückstellungen</w:t>
+      </w:r>
+      <w:proofErr w:type="spellEnd"/>
+      <w:r>
+        <w:t>: _____________________________________</w:t>
       </w:r>
     </w:p>
     <w:p>
@@ -445,8 +1671,21 @@
       <w:bookmarkStart w:id="7" w:name="cp-04-preise-dauer-und-leistungsumfang"/>
       <w:bookmarkEnd w:id="6"/>
       <w:r>
-        <w:t>CP-04: Preise, Dauer und Leistungsumfang</w:t>
-      </w:r>
+        <w:t xml:space="preserve">CP-04: </w:t>
+      </w:r>
+      <w:proofErr w:type="spellStart"/>
+      <w:r>
+        <w:t>Preise</w:t>
+      </w:r>
+      <w:proofErr w:type="spellEnd"/>
+      <w:r>
+        <w:t xml:space="preserve">, Dauer und </w:t>
+      </w:r>
+      <w:proofErr w:type="spellStart"/>
+      <w:r>
+        <w:t>Leistungsumfang</w:t>
+      </w:r>
+      <w:proofErr w:type="spellEnd"/>
     </w:p>
     <w:p>
       <w:pPr>
@@ -460,50 +1699,288 @@
         <w:t>Frage:</w:t>
       </w:r>
       <w:r>
-        <w:t xml:space="preserve"> Welche derzeit genannten Preise, Zeitangaben und Leistungsumfänge sind aktuell freigegeben?</w:t>
+        <w:t xml:space="preserve"> </w:t>
+      </w:r>
+      <w:proofErr w:type="spellStart"/>
+      <w:r>
+        <w:t>Welche</w:t>
+      </w:r>
+      <w:proofErr w:type="spellEnd"/>
+      <w:r>
+        <w:t xml:space="preserve"> </w:t>
+      </w:r>
+      <w:proofErr w:type="spellStart"/>
+      <w:r>
+        <w:t>derzeit</w:t>
+      </w:r>
+      <w:proofErr w:type="spellEnd"/>
+      <w:r>
+        <w:t xml:space="preserve"> </w:t>
+      </w:r>
+      <w:proofErr w:type="spellStart"/>
+      <w:r>
+        <w:t>genannten</w:t>
+      </w:r>
+      <w:proofErr w:type="spellEnd"/>
+      <w:r>
+        <w:t xml:space="preserve"> </w:t>
+      </w:r>
+      <w:proofErr w:type="spellStart"/>
+      <w:r>
+        <w:t>Preise</w:t>
+      </w:r>
+      <w:proofErr w:type="spellEnd"/>
+      <w:r>
+        <w:t xml:space="preserve">, </w:t>
+      </w:r>
+      <w:proofErr w:type="spellStart"/>
+      <w:r>
+        <w:t>Zeitangaben</w:t>
+      </w:r>
+      <w:proofErr w:type="spellEnd"/>
+      <w:r>
+        <w:t xml:space="preserve"> und </w:t>
+      </w:r>
+      <w:proofErr w:type="spellStart"/>
+      <w:r>
+        <w:t>Leistungsumfänge</w:t>
+      </w:r>
+      <w:proofErr w:type="spellEnd"/>
+      <w:r>
+        <w:t xml:space="preserve"> </w:t>
+      </w:r>
+      <w:proofErr w:type="spellStart"/>
+      <w:r>
+        <w:t>sind</w:t>
+      </w:r>
+      <w:proofErr w:type="spellEnd"/>
+      <w:r>
+        <w:t xml:space="preserve"> </w:t>
+      </w:r>
+      <w:proofErr w:type="spellStart"/>
+      <w:r>
+        <w:t>aktuell</w:t>
+      </w:r>
+      <w:proofErr w:type="spellEnd"/>
+      <w:r>
+        <w:t xml:space="preserve"> </w:t>
+      </w:r>
+      <w:proofErr w:type="spellStart"/>
+      <w:r>
+        <w:t>freigegeben</w:t>
+      </w:r>
+      <w:proofErr w:type="spellEnd"/>
+      <w:r>
+        <w:t>?</w:t>
       </w:r>
     </w:p>
     <w:p>
       <w:pPr>
         <w:pStyle w:val="Textkrper"/>
       </w:pPr>
+      <w:proofErr w:type="spellStart"/>
       <w:r>
         <w:rPr>
           <w:b/>
           <w:bCs/>
         </w:rPr>
-        <w:t>Empfehlung:</w:t>
-      </w:r>
-      <w:r>
-        <w:t xml:space="preserve"> Jede kommerzielle Angabe erhält eine verantwortliche Person, ein Freigabedatum und bei Bedarf ein Gültigkeitsdatum.</w:t>
-      </w:r>
-    </w:p>
-    <w:p>
-      <w:pPr>
-        <w:pStyle w:val="Textkrper"/>
-      </w:pPr>
+        <w:t>Empfehlung</w:t>
+      </w:r>
+      <w:proofErr w:type="spellEnd"/>
       <w:r>
         <w:rPr>
           <w:b/>
           <w:bCs/>
         </w:rPr>
-        <w:t>Antwort:</w:t>
+        <w:t>:</w:t>
+      </w:r>
+      <w:r>
+        <w:t xml:space="preserve"> </w:t>
+      </w:r>
+      <w:proofErr w:type="spellStart"/>
+      <w:r>
+        <w:t>Jede</w:t>
+      </w:r>
+      <w:proofErr w:type="spellEnd"/>
+      <w:r>
+        <w:t xml:space="preserve"> </w:t>
+      </w:r>
+      <w:proofErr w:type="spellStart"/>
+      <w:r>
+        <w:t>kommerzielle</w:t>
+      </w:r>
+      <w:proofErr w:type="spellEnd"/>
+      <w:r>
+        <w:t xml:space="preserve"> </w:t>
+      </w:r>
+      <w:proofErr w:type="spellStart"/>
+      <w:r>
+        <w:t>Angabe</w:t>
+      </w:r>
+      <w:proofErr w:type="spellEnd"/>
+      <w:r>
+        <w:t xml:space="preserve"> </w:t>
+      </w:r>
+      <w:proofErr w:type="spellStart"/>
+      <w:r>
+        <w:t>erhält</w:t>
+      </w:r>
+      <w:proofErr w:type="spellEnd"/>
+      <w:r>
+        <w:t xml:space="preserve"> </w:t>
+      </w:r>
+      <w:proofErr w:type="spellStart"/>
+      <w:r>
+        <w:t>eine</w:t>
+      </w:r>
+      <w:proofErr w:type="spellEnd"/>
+      <w:r>
+        <w:t xml:space="preserve"> </w:t>
+      </w:r>
+      <w:proofErr w:type="spellStart"/>
+      <w:r>
+        <w:t>verantwortliche</w:t>
+      </w:r>
+      <w:proofErr w:type="spellEnd"/>
+      <w:r>
+        <w:t xml:space="preserve"> Person, </w:t>
+      </w:r>
+      <w:proofErr w:type="spellStart"/>
+      <w:r>
+        <w:t>ein</w:t>
+      </w:r>
+      <w:proofErr w:type="spellEnd"/>
+      <w:r>
+        <w:t xml:space="preserve"> </w:t>
+      </w:r>
+      <w:proofErr w:type="spellStart"/>
+      <w:r>
+        <w:t>Freigabedatum</w:t>
+      </w:r>
+      <w:proofErr w:type="spellEnd"/>
+      <w:r>
+        <w:t xml:space="preserve"> und </w:t>
+      </w:r>
+      <w:proofErr w:type="spellStart"/>
+      <w:r>
+        <w:t>bei</w:t>
+      </w:r>
+      <w:proofErr w:type="spellEnd"/>
+      <w:r>
+        <w:t xml:space="preserve"> </w:t>
+      </w:r>
+      <w:proofErr w:type="spellStart"/>
+      <w:r>
+        <w:t>Bedarf</w:t>
+      </w:r>
+      <w:proofErr w:type="spellEnd"/>
+      <w:r>
+        <w:t xml:space="preserve"> </w:t>
+      </w:r>
+      <w:proofErr w:type="spellStart"/>
+      <w:r>
+        <w:t>ein</w:t>
+      </w:r>
+      <w:proofErr w:type="spellEnd"/>
+      <w:r>
+        <w:t xml:space="preserve"> </w:t>
+      </w:r>
+      <w:proofErr w:type="spellStart"/>
+      <w:r>
+        <w:t>Gültigkeitsdatum</w:t>
+      </w:r>
+      <w:proofErr w:type="spellEnd"/>
+      <w:r>
+        <w:t>.</w:t>
       </w:r>
     </w:p>
     <w:p>
       <w:pPr>
         <w:pStyle w:val="Textkrper"/>
       </w:pPr>
-      <w:r>
-        <w:t>[ ] Aktuelle Angaben freigegeben</w:t>
-      </w:r>
+      <w:proofErr w:type="spellStart"/>
+      <w:r>
+        <w:rPr>
+          <w:b/>
+          <w:bCs/>
+        </w:rPr>
+        <w:t>Antwort</w:t>
+      </w:r>
+      <w:proofErr w:type="spellEnd"/>
+      <w:r>
+        <w:rPr>
+          <w:b/>
+          <w:bCs/>
+        </w:rPr>
+        <w:t>:</w:t>
+      </w:r>
+    </w:p>
+    <w:p>
+      <w:pPr>
+        <w:pStyle w:val="Textkrper"/>
+      </w:pPr>
+      <w:r>
+        <w:t>[</w:t>
+      </w:r>
+      <w:proofErr w:type="gramStart"/>
+      <w:r>
+        <w:t>x</w:t>
+      </w:r>
+      <w:r>
+        <w:t xml:space="preserve"> ]</w:t>
+      </w:r>
+      <w:proofErr w:type="gramEnd"/>
+      <w:r>
+        <w:t xml:space="preserve"> </w:t>
+      </w:r>
+      <w:proofErr w:type="spellStart"/>
+      <w:r>
+        <w:t>Aktuelle</w:t>
+      </w:r>
+      <w:proofErr w:type="spellEnd"/>
+      <w:r>
+        <w:t xml:space="preserve"> </w:t>
+      </w:r>
+      <w:proofErr w:type="spellStart"/>
+      <w:r>
+        <w:t>Angaben</w:t>
+      </w:r>
+      <w:proofErr w:type="spellEnd"/>
+      <w:r>
+        <w:t xml:space="preserve"> </w:t>
+      </w:r>
+      <w:proofErr w:type="spellStart"/>
+      <w:r>
+        <w:t>freigegeben</w:t>
+      </w:r>
+      <w:proofErr w:type="spellEnd"/>
       <w:r>
         <w:br/>
-        <w:t>[ ] Noch offen</w:t>
-      </w:r>
+        <w:t xml:space="preserve">[ ] Noch </w:t>
+      </w:r>
+      <w:proofErr w:type="spellStart"/>
+      <w:r>
+        <w:t>offen</w:t>
+      </w:r>
+      <w:proofErr w:type="spellEnd"/>
       <w:r>
         <w:br/>
-        <w:t>Verantwortliche Person / Korrekturen: ____________________________________</w:t>
+      </w:r>
+      <w:proofErr w:type="spellStart"/>
+      <w:r>
+        <w:t>Verantwortliche</w:t>
+      </w:r>
+      <w:proofErr w:type="spellEnd"/>
+      <w:r>
+        <w:t xml:space="preserve"> Person / </w:t>
+      </w:r>
+      <w:proofErr w:type="spellStart"/>
+      <w:r>
+        <w:t>Korrekturen</w:t>
+      </w:r>
+      <w:proofErr w:type="spellEnd"/>
+      <w:r>
+        <w:t>: ____________________________________</w:t>
       </w:r>
     </w:p>
     <w:p>
@@ -520,8 +1997,29 @@
       <w:bookmarkStart w:id="8" w:name="cp-05-perspektive-im-businesscoaching"/>
       <w:bookmarkEnd w:id="7"/>
       <w:r>
-        <w:t>CP-05: Perspektive im Businesscoaching</w:t>
-      </w:r>
+        <w:t xml:space="preserve">CP-05: </w:t>
+      </w:r>
+      <w:proofErr w:type="spellStart"/>
+      <w:r>
+        <w:t>Perspektive</w:t>
+      </w:r>
+      <w:proofErr w:type="spellEnd"/>
+      <w:r>
+        <w:t xml:space="preserve"> </w:t>
+      </w:r>
+      <w:proofErr w:type="spellStart"/>
+      <w:r>
+        <w:t>im</w:t>
+      </w:r>
+      <w:proofErr w:type="spellEnd"/>
+      <w:r>
+        <w:t xml:space="preserve"> </w:t>
+      </w:r>
+      <w:proofErr w:type="spellStart"/>
+      <w:r>
+        <w:t>Businesscoaching</w:t>
+      </w:r>
+      <w:proofErr w:type="spellEnd"/>
     </w:p>
     <w:p>
       <w:pPr>
@@ -535,46 +2033,269 @@
         <w:t>Frage:</w:t>
       </w:r>
       <w:r>
-        <w:t xml:space="preserve"> Aus wessen Perspektive soll die Seite Businesscoaching hauptsächlich sprechen?</w:t>
+        <w:t xml:space="preserve"> Aus </w:t>
+      </w:r>
+      <w:proofErr w:type="spellStart"/>
+      <w:r>
+        <w:t>wessen</w:t>
+      </w:r>
+      <w:proofErr w:type="spellEnd"/>
+      <w:r>
+        <w:t xml:space="preserve"> </w:t>
+      </w:r>
+      <w:proofErr w:type="spellStart"/>
+      <w:r>
+        <w:t>Perspektive</w:t>
+      </w:r>
+      <w:proofErr w:type="spellEnd"/>
+      <w:r>
+        <w:t xml:space="preserve"> </w:t>
+      </w:r>
+      <w:proofErr w:type="spellStart"/>
+      <w:r>
+        <w:t>soll</w:t>
+      </w:r>
+      <w:proofErr w:type="spellEnd"/>
+      <w:r>
+        <w:t xml:space="preserve"> die </w:t>
+      </w:r>
+      <w:proofErr w:type="spellStart"/>
+      <w:r>
+        <w:t>Seite</w:t>
+      </w:r>
+      <w:proofErr w:type="spellEnd"/>
+      <w:r>
+        <w:t xml:space="preserve"> </w:t>
+      </w:r>
+      <w:proofErr w:type="spellStart"/>
+      <w:r>
+        <w:t>Businesscoaching</w:t>
+      </w:r>
+      <w:proofErr w:type="spellEnd"/>
+      <w:r>
+        <w:t xml:space="preserve"> </w:t>
+      </w:r>
+      <w:proofErr w:type="spellStart"/>
+      <w:r>
+        <w:t>hauptsächlich</w:t>
+      </w:r>
+      <w:proofErr w:type="spellEnd"/>
+      <w:r>
+        <w:t xml:space="preserve"> </w:t>
+      </w:r>
+      <w:proofErr w:type="spellStart"/>
+      <w:r>
+        <w:t>sprechen</w:t>
+      </w:r>
+      <w:proofErr w:type="spellEnd"/>
+      <w:r>
+        <w:t>?</w:t>
       </w:r>
     </w:p>
     <w:p>
       <w:pPr>
         <w:pStyle w:val="Textkrper"/>
       </w:pPr>
+      <w:proofErr w:type="spellStart"/>
       <w:r>
         <w:rPr>
           <w:b/>
           <w:bCs/>
         </w:rPr>
-        <w:t>Empfehlung:</w:t>
-      </w:r>
-      <w:r>
-        <w:t xml:space="preserve"> Unternehmensentscheider und Führungskräfte zuerst; Teilnehmendenperspektive ergänzend.</w:t>
-      </w:r>
-    </w:p>
-    <w:p>
-      <w:pPr>
-        <w:pStyle w:val="Textkrper"/>
-      </w:pPr>
+        <w:t>Empfehlung</w:t>
+      </w:r>
+      <w:proofErr w:type="spellEnd"/>
       <w:r>
         <w:rPr>
           <w:b/>
           <w:bCs/>
         </w:rPr>
-        <w:t>Antwort:</w:t>
+        <w:t>:</w:t>
+      </w:r>
+      <w:r>
+        <w:t xml:space="preserve"> </w:t>
+      </w:r>
+      <w:proofErr w:type="spellStart"/>
+      <w:r>
+        <w:t>Unternehmensentscheider</w:t>
+      </w:r>
+      <w:proofErr w:type="spellEnd"/>
+      <w:r>
+        <w:t xml:space="preserve"> und </w:t>
+      </w:r>
+      <w:proofErr w:type="spellStart"/>
+      <w:r>
+        <w:t>Führungskräfte</w:t>
+      </w:r>
+      <w:proofErr w:type="spellEnd"/>
+      <w:r>
+        <w:t xml:space="preserve"> </w:t>
+      </w:r>
+      <w:proofErr w:type="spellStart"/>
+      <w:r>
+        <w:t>zuerst</w:t>
+      </w:r>
+      <w:proofErr w:type="spellEnd"/>
+      <w:r>
+        <w:t xml:space="preserve">; </w:t>
+      </w:r>
+      <w:proofErr w:type="spellStart"/>
+      <w:r>
+        <w:t>Teilnehmendenperspektive</w:t>
+      </w:r>
+      <w:proofErr w:type="spellEnd"/>
+      <w:r>
+        <w:t xml:space="preserve"> </w:t>
+      </w:r>
+      <w:proofErr w:type="spellStart"/>
+      <w:r>
+        <w:t>ergänzend</w:t>
+      </w:r>
+      <w:proofErr w:type="spellEnd"/>
+      <w:r>
+        <w:t>.</w:t>
       </w:r>
     </w:p>
     <w:p>
       <w:pPr>
         <w:pStyle w:val="Textkrper"/>
       </w:pPr>
-      <w:r>
-        <w:t>[ ] Empfehlung freigegeben</w:t>
-      </w:r>
+      <w:proofErr w:type="spellStart"/>
+      <w:r>
+        <w:rPr>
+          <w:b/>
+          <w:bCs/>
+        </w:rPr>
+        <w:t>Antwort</w:t>
+      </w:r>
+      <w:proofErr w:type="spellEnd"/>
+      <w:r>
+        <w:rPr>
+          <w:b/>
+          <w:bCs/>
+        </w:rPr>
+        <w:t>:</w:t>
+      </w:r>
+    </w:p>
+    <w:p>
+      <w:pPr>
+        <w:pStyle w:val="Textkrper"/>
+      </w:pPr>
+      <w:proofErr w:type="gramStart"/>
+      <w:r>
+        <w:t>[ ]</w:t>
+      </w:r>
+      <w:proofErr w:type="gramEnd"/>
+      <w:r>
+        <w:t xml:space="preserve"> </w:t>
+      </w:r>
+      <w:proofErr w:type="spellStart"/>
+      <w:r>
+        <w:t>Empfehlung</w:t>
+      </w:r>
+      <w:proofErr w:type="spellEnd"/>
+      <w:r>
+        <w:t xml:space="preserve"> </w:t>
+      </w:r>
+      <w:proofErr w:type="spellStart"/>
+      <w:r>
+        <w:t>freigegeben</w:t>
+      </w:r>
+      <w:proofErr w:type="spellEnd"/>
       <w:r>
         <w:br/>
-        <w:t>[ ] Andere Priorität: ___________________________________________________</w:t>
+        <w:t>[</w:t>
+      </w:r>
+      <w:r>
+        <w:t>x</w:t>
+      </w:r>
+      <w:r>
+        <w:t xml:space="preserve"> ] </w:t>
+      </w:r>
+      <w:proofErr w:type="spellStart"/>
+      <w:r>
+        <w:t>Andere</w:t>
+      </w:r>
+      <w:proofErr w:type="spellEnd"/>
+      <w:r>
+        <w:t xml:space="preserve"> </w:t>
+      </w:r>
+      <w:proofErr w:type="spellStart"/>
+      <w:r>
+        <w:t>Priorität</w:t>
+      </w:r>
+      <w:proofErr w:type="spellEnd"/>
+      <w:r>
+        <w:t>: ___________________________________________________</w:t>
+      </w:r>
+    </w:p>
+    <w:p>
+      <w:pPr>
+        <w:pStyle w:val="Textkrper"/>
+      </w:pPr>
+      <w:proofErr w:type="spellStart"/>
+      <w:r>
+        <w:t>Innerhalb</w:t>
+      </w:r>
+      <w:proofErr w:type="spellEnd"/>
+      <w:r>
+        <w:t xml:space="preserve"> der </w:t>
+      </w:r>
+      <w:proofErr w:type="spellStart"/>
+      <w:r>
+        <w:t>Mindforge</w:t>
+      </w:r>
+      <w:proofErr w:type="spellEnd"/>
+      <w:r>
+        <w:t xml:space="preserve"> </w:t>
+      </w:r>
+      <w:proofErr w:type="spellStart"/>
+      <w:r>
+        <w:t>gibt</w:t>
+      </w:r>
+      <w:proofErr w:type="spellEnd"/>
+      <w:r>
+        <w:t xml:space="preserve"> es </w:t>
+      </w:r>
+      <w:proofErr w:type="spellStart"/>
+      <w:r>
+        <w:t>einmal</w:t>
+      </w:r>
+      <w:proofErr w:type="spellEnd"/>
+      <w:r>
+        <w:t xml:space="preserve"> </w:t>
+      </w:r>
+      <w:proofErr w:type="spellStart"/>
+      <w:r>
+        <w:t>Beratungsgespräche</w:t>
+      </w:r>
+      <w:proofErr w:type="spellEnd"/>
+      <w:r>
+        <w:t xml:space="preserve"> für </w:t>
+      </w:r>
+      <w:proofErr w:type="spellStart"/>
+      <w:r>
+        <w:t>Privatpersonen</w:t>
+      </w:r>
+      <w:proofErr w:type="spellEnd"/>
+      <w:r>
+        <w:t xml:space="preserve"> und </w:t>
+      </w:r>
+      <w:proofErr w:type="spellStart"/>
+      <w:r>
+        <w:t>Businesscoaching</w:t>
+      </w:r>
+      <w:proofErr w:type="spellEnd"/>
+      <w:r>
+        <w:t xml:space="preserve"> für </w:t>
+      </w:r>
+      <w:proofErr w:type="spellStart"/>
+      <w:r>
+        <w:t>Firmen</w:t>
+      </w:r>
+      <w:proofErr w:type="spellEnd"/>
+      <w:r>
+        <w:t xml:space="preserve"> </w:t>
       </w:r>
     </w:p>
     <w:p>
@@ -584,8 +2305,13 @@
       <w:bookmarkStart w:id="9" w:name="cp-06-aufbau-der-mindforge-seite"/>
       <w:bookmarkEnd w:id="8"/>
       <w:r>
-        <w:t>CP-06: Aufbau der Mindforge-Seite</w:t>
-      </w:r>
+        <w:t xml:space="preserve">CP-06: Aufbau der </w:t>
+      </w:r>
+      <w:proofErr w:type="spellStart"/>
+      <w:r>
+        <w:t>Mindforge-Seite</w:t>
+      </w:r>
+      <w:proofErr w:type="spellEnd"/>
     </w:p>
     <w:p>
       <w:pPr>
@@ -599,46 +2325,272 @@
         <w:t>Frage:</w:t>
       </w:r>
       <w:r>
-        <w:t xml:space="preserve"> Soll Mindforge vorerst eine gemeinsame Seite für Privat- und Firmenkunden bleiben?</w:t>
+        <w:t xml:space="preserve"> Soll </w:t>
+      </w:r>
+      <w:proofErr w:type="spellStart"/>
+      <w:r>
+        <w:t>Mindforge</w:t>
+      </w:r>
+      <w:proofErr w:type="spellEnd"/>
+      <w:r>
+        <w:t xml:space="preserve"> </w:t>
+      </w:r>
+      <w:proofErr w:type="spellStart"/>
+      <w:r>
+        <w:t>vorerst</w:t>
+      </w:r>
+      <w:proofErr w:type="spellEnd"/>
+      <w:r>
+        <w:t xml:space="preserve"> </w:t>
+      </w:r>
+      <w:proofErr w:type="spellStart"/>
+      <w:r>
+        <w:t>eine</w:t>
+      </w:r>
+      <w:proofErr w:type="spellEnd"/>
+      <w:r>
+        <w:t xml:space="preserve"> </w:t>
+      </w:r>
+      <w:proofErr w:type="spellStart"/>
+      <w:r>
+        <w:t>gemeinsame</w:t>
+      </w:r>
+      <w:proofErr w:type="spellEnd"/>
+      <w:r>
+        <w:t xml:space="preserve"> </w:t>
+      </w:r>
+      <w:proofErr w:type="spellStart"/>
+      <w:r>
+        <w:t>Seite</w:t>
+      </w:r>
+      <w:proofErr w:type="spellEnd"/>
+      <w:r>
+        <w:t xml:space="preserve"> für Privat- und </w:t>
+      </w:r>
+      <w:proofErr w:type="spellStart"/>
+      <w:r>
+        <w:t>Firmenkunden</w:t>
+      </w:r>
+      <w:proofErr w:type="spellEnd"/>
+      <w:r>
+        <w:t xml:space="preserve"> </w:t>
+      </w:r>
+      <w:proofErr w:type="spellStart"/>
+      <w:r>
+        <w:t>bleiben</w:t>
+      </w:r>
+      <w:proofErr w:type="spellEnd"/>
+      <w:r>
+        <w:t>?</w:t>
       </w:r>
     </w:p>
     <w:p>
       <w:pPr>
         <w:pStyle w:val="Textkrper"/>
       </w:pPr>
+      <w:proofErr w:type="spellStart"/>
       <w:r>
         <w:rPr>
           <w:b/>
           <w:bCs/>
         </w:rPr>
-        <w:t>Empfehlung:</w:t>
-      </w:r>
-      <w:r>
-        <w:t xml:space="preserve"> Ja. Beide Wege werden deutlich getrennt dargestellt. Über zwei eigenständige Seiten wird erst nach Nutzungstests entschieden.</w:t>
-      </w:r>
-    </w:p>
-    <w:p>
-      <w:pPr>
-        <w:pStyle w:val="Textkrper"/>
-      </w:pPr>
+        <w:t>Empfehlung</w:t>
+      </w:r>
+      <w:proofErr w:type="spellEnd"/>
       <w:r>
         <w:rPr>
           <w:b/>
           <w:bCs/>
         </w:rPr>
-        <w:t>Antwort:</w:t>
+        <w:t>:</w:t>
+      </w:r>
+      <w:r>
+        <w:t xml:space="preserve"> Ja. </w:t>
+      </w:r>
+      <w:proofErr w:type="spellStart"/>
+      <w:r>
+        <w:t>Beide</w:t>
+      </w:r>
+      <w:proofErr w:type="spellEnd"/>
+      <w:r>
+        <w:t xml:space="preserve"> </w:t>
+      </w:r>
+      <w:proofErr w:type="spellStart"/>
+      <w:r>
+        <w:t>Wege</w:t>
+      </w:r>
+      <w:proofErr w:type="spellEnd"/>
+      <w:r>
+        <w:t xml:space="preserve"> </w:t>
+      </w:r>
+      <w:proofErr w:type="spellStart"/>
+      <w:r>
+        <w:t>werden</w:t>
+      </w:r>
+      <w:proofErr w:type="spellEnd"/>
+      <w:r>
+        <w:t xml:space="preserve"> </w:t>
+      </w:r>
+      <w:proofErr w:type="spellStart"/>
+      <w:r>
+        <w:t>deutlich</w:t>
+      </w:r>
+      <w:proofErr w:type="spellEnd"/>
+      <w:r>
+        <w:t xml:space="preserve"> </w:t>
+      </w:r>
+      <w:proofErr w:type="spellStart"/>
+      <w:r>
+        <w:t>getrennt</w:t>
+      </w:r>
+      <w:proofErr w:type="spellEnd"/>
+      <w:r>
+        <w:t xml:space="preserve"> </w:t>
+      </w:r>
+      <w:proofErr w:type="spellStart"/>
+      <w:r>
+        <w:t>dargestellt</w:t>
+      </w:r>
+      <w:proofErr w:type="spellEnd"/>
+      <w:r>
+        <w:t xml:space="preserve">. </w:t>
+      </w:r>
+      <w:proofErr w:type="spellStart"/>
+      <w:r>
+        <w:t>Über</w:t>
+      </w:r>
+      <w:proofErr w:type="spellEnd"/>
+      <w:r>
+        <w:t xml:space="preserve"> </w:t>
+      </w:r>
+      <w:proofErr w:type="spellStart"/>
+      <w:r>
+        <w:t>zwei</w:t>
+      </w:r>
+      <w:proofErr w:type="spellEnd"/>
+      <w:r>
+        <w:t xml:space="preserve"> </w:t>
+      </w:r>
+      <w:proofErr w:type="spellStart"/>
+      <w:r>
+        <w:t>eigenständige</w:t>
+      </w:r>
+      <w:proofErr w:type="spellEnd"/>
+      <w:r>
+        <w:t xml:space="preserve"> Seiten </w:t>
+      </w:r>
+      <w:proofErr w:type="spellStart"/>
+      <w:r>
+        <w:t>wird</w:t>
+      </w:r>
+      <w:proofErr w:type="spellEnd"/>
+      <w:r>
+        <w:t xml:space="preserve"> erst </w:t>
+      </w:r>
+      <w:proofErr w:type="spellStart"/>
+      <w:r>
+        <w:t>nach</w:t>
+      </w:r>
+      <w:proofErr w:type="spellEnd"/>
+      <w:r>
+        <w:t xml:space="preserve"> </w:t>
+      </w:r>
+      <w:proofErr w:type="spellStart"/>
+      <w:r>
+        <w:t>Nutzungstests</w:t>
+      </w:r>
+      <w:proofErr w:type="spellEnd"/>
+      <w:r>
+        <w:t xml:space="preserve"> </w:t>
+      </w:r>
+      <w:proofErr w:type="spellStart"/>
+      <w:r>
+        <w:t>entschieden</w:t>
+      </w:r>
+      <w:proofErr w:type="spellEnd"/>
+      <w:r>
+        <w:t>.</w:t>
       </w:r>
     </w:p>
     <w:p>
       <w:pPr>
         <w:pStyle w:val="Textkrper"/>
       </w:pPr>
-      <w:r>
-        <w:t>[ ] Empfehlung freigegeben</w:t>
-      </w:r>
+      <w:proofErr w:type="spellStart"/>
+      <w:r>
+        <w:rPr>
+          <w:b/>
+          <w:bCs/>
+        </w:rPr>
+        <w:t>Antwort</w:t>
+      </w:r>
+      <w:proofErr w:type="spellEnd"/>
+      <w:r>
+        <w:rPr>
+          <w:b/>
+          <w:bCs/>
+        </w:rPr>
+        <w:t>:</w:t>
+      </w:r>
+    </w:p>
+    <w:p>
+      <w:pPr>
+        <w:pStyle w:val="Textkrper"/>
+      </w:pPr>
+      <w:r>
+        <w:t>[</w:t>
+      </w:r>
+      <w:proofErr w:type="gramStart"/>
+      <w:r>
+        <w:t>x</w:t>
+      </w:r>
+      <w:r>
+        <w:t xml:space="preserve"> ]</w:t>
+      </w:r>
+      <w:proofErr w:type="gramEnd"/>
+      <w:r>
+        <w:t xml:space="preserve"> </w:t>
+      </w:r>
+      <w:proofErr w:type="spellStart"/>
+      <w:r>
+        <w:t>Empfehlung</w:t>
+      </w:r>
+      <w:proofErr w:type="spellEnd"/>
+      <w:r>
+        <w:t xml:space="preserve"> </w:t>
+      </w:r>
+      <w:proofErr w:type="spellStart"/>
+      <w:r>
+        <w:t>freigegeben</w:t>
+      </w:r>
+      <w:proofErr w:type="spellEnd"/>
       <w:r>
         <w:br/>
-        <w:t>[ ] Frühere Trennung gewünscht: _________________________________________</w:t>
+        <w:t xml:space="preserve">[ ] </w:t>
+      </w:r>
+      <w:proofErr w:type="spellStart"/>
+      <w:r>
+        <w:t>Frühere</w:t>
+      </w:r>
+      <w:proofErr w:type="spellEnd"/>
+      <w:r>
+        <w:t xml:space="preserve"> </w:t>
+      </w:r>
+      <w:proofErr w:type="spellStart"/>
+      <w:r>
+        <w:t>Trennung</w:t>
+      </w:r>
+      <w:proofErr w:type="spellEnd"/>
+      <w:r>
+        <w:t xml:space="preserve"> </w:t>
+      </w:r>
+      <w:proofErr w:type="spellStart"/>
+      <w:r>
+        <w:t>gewünscht</w:t>
+      </w:r>
+      <w:proofErr w:type="spellEnd"/>
+      <w:r>
+        <w:t>: _________________________________________</w:t>
       </w:r>
     </w:p>
     <w:p>
@@ -651,8 +2603,30 @@
         <w:br w:type="page"/>
       </w:r>
       <w:r>
-        <w:t>CP-07: Fachliche und rechtliche Grenze</w:t>
-      </w:r>
+        <w:lastRenderedPageBreak/>
+        <w:t xml:space="preserve">CP-07: </w:t>
+      </w:r>
+      <w:proofErr w:type="spellStart"/>
+      <w:r>
+        <w:t>Fachliche</w:t>
+      </w:r>
+      <w:proofErr w:type="spellEnd"/>
+      <w:r>
+        <w:t xml:space="preserve"> und </w:t>
+      </w:r>
+      <w:proofErr w:type="spellStart"/>
+      <w:r>
+        <w:t>rechtliche</w:t>
+      </w:r>
+      <w:proofErr w:type="spellEnd"/>
+      <w:r>
+        <w:t xml:space="preserve"> </w:t>
+      </w:r>
+      <w:proofErr w:type="spellStart"/>
+      <w:r>
+        <w:t>Grenze</w:t>
+      </w:r>
+      <w:proofErr w:type="spellEnd"/>
     </w:p>
     <w:p>
       <w:pPr>
@@ -666,34 +2640,180 @@
         <w:t>Frage:</w:t>
       </w:r>
       <w:r>
-        <w:t xml:space="preserve"> Wer prüft die Abgrenzung zu Psychotherapie, medizinischer Beratung und akuter Krisenhilfe?</w:t>
+        <w:t xml:space="preserve"> </w:t>
+      </w:r>
+      <w:proofErr w:type="spellStart"/>
+      <w:r>
+        <w:t>Wer</w:t>
+      </w:r>
+      <w:proofErr w:type="spellEnd"/>
+      <w:r>
+        <w:t xml:space="preserve"> </w:t>
+      </w:r>
+      <w:proofErr w:type="spellStart"/>
+      <w:r>
+        <w:t>prüft</w:t>
+      </w:r>
+      <w:proofErr w:type="spellEnd"/>
+      <w:r>
+        <w:t xml:space="preserve"> die </w:t>
+      </w:r>
+      <w:proofErr w:type="spellStart"/>
+      <w:r>
+        <w:t>Abgrenzung</w:t>
+      </w:r>
+      <w:proofErr w:type="spellEnd"/>
+      <w:r>
+        <w:t xml:space="preserve"> </w:t>
+      </w:r>
+      <w:proofErr w:type="spellStart"/>
+      <w:r>
+        <w:t>zu</w:t>
+      </w:r>
+      <w:proofErr w:type="spellEnd"/>
+      <w:r>
+        <w:t xml:space="preserve"> Psychotherapie, </w:t>
+      </w:r>
+      <w:proofErr w:type="spellStart"/>
+      <w:r>
+        <w:t>medizinischer</w:t>
+      </w:r>
+      <w:proofErr w:type="spellEnd"/>
+      <w:r>
+        <w:t xml:space="preserve"> </w:t>
+      </w:r>
+      <w:proofErr w:type="spellStart"/>
+      <w:r>
+        <w:t>Beratung</w:t>
+      </w:r>
+      <w:proofErr w:type="spellEnd"/>
+      <w:r>
+        <w:t xml:space="preserve"> und </w:t>
+      </w:r>
+      <w:proofErr w:type="spellStart"/>
+      <w:r>
+        <w:t>akuter</w:t>
+      </w:r>
+      <w:proofErr w:type="spellEnd"/>
+      <w:r>
+        <w:t xml:space="preserve"> </w:t>
+      </w:r>
+      <w:proofErr w:type="spellStart"/>
+      <w:r>
+        <w:t>Krisenhilfe</w:t>
+      </w:r>
+      <w:proofErr w:type="spellEnd"/>
+      <w:r>
+        <w:t>?</w:t>
       </w:r>
     </w:p>
     <w:p>
       <w:pPr>
         <w:pStyle w:val="Textkrper"/>
       </w:pPr>
+      <w:proofErr w:type="spellStart"/>
       <w:r>
         <w:rPr>
           <w:b/>
           <w:bCs/>
         </w:rPr>
-        <w:t>Empfehlung:</w:t>
-      </w:r>
-      <w:r>
-        <w:t xml:space="preserve"> Fachliche und rechtliche Prüfung mit dokumentiertem Wortlaut vor dem Produktionsstart.</w:t>
-      </w:r>
-    </w:p>
-    <w:p>
-      <w:pPr>
-        <w:pStyle w:val="Textkrper"/>
-      </w:pPr>
+        <w:t>Empfehlung</w:t>
+      </w:r>
+      <w:proofErr w:type="spellEnd"/>
       <w:r>
         <w:rPr>
           <w:b/>
           <w:bCs/>
         </w:rPr>
-        <w:t>Antwort:</w:t>
+        <w:t>:</w:t>
+      </w:r>
+      <w:r>
+        <w:t xml:space="preserve"> </w:t>
+      </w:r>
+      <w:proofErr w:type="spellStart"/>
+      <w:r>
+        <w:t>Fachliche</w:t>
+      </w:r>
+      <w:proofErr w:type="spellEnd"/>
+      <w:r>
+        <w:t xml:space="preserve"> und </w:t>
+      </w:r>
+      <w:proofErr w:type="spellStart"/>
+      <w:r>
+        <w:t>rechtliche</w:t>
+      </w:r>
+      <w:proofErr w:type="spellEnd"/>
+      <w:r>
+        <w:t xml:space="preserve"> </w:t>
+      </w:r>
+      <w:proofErr w:type="spellStart"/>
+      <w:r>
+        <w:t>Prüfung</w:t>
+      </w:r>
+      <w:proofErr w:type="spellEnd"/>
+      <w:r>
+        <w:t xml:space="preserve"> </w:t>
+      </w:r>
+      <w:proofErr w:type="spellStart"/>
+      <w:r>
+        <w:t>mit</w:t>
+      </w:r>
+      <w:proofErr w:type="spellEnd"/>
+      <w:r>
+        <w:t xml:space="preserve"> </w:t>
+      </w:r>
+      <w:proofErr w:type="spellStart"/>
+      <w:r>
+        <w:t>dokumentiertem</w:t>
+      </w:r>
+      <w:proofErr w:type="spellEnd"/>
+      <w:r>
+        <w:t xml:space="preserve"> </w:t>
+      </w:r>
+      <w:proofErr w:type="spellStart"/>
+      <w:r>
+        <w:t>Wortlaut</w:t>
+      </w:r>
+      <w:proofErr w:type="spellEnd"/>
+      <w:r>
+        <w:t xml:space="preserve"> </w:t>
+      </w:r>
+      <w:proofErr w:type="spellStart"/>
+      <w:r>
+        <w:t>vor</w:t>
+      </w:r>
+      <w:proofErr w:type="spellEnd"/>
+      <w:r>
+        <w:t xml:space="preserve"> dem </w:t>
+      </w:r>
+      <w:proofErr w:type="spellStart"/>
+      <w:r>
+        <w:t>Produktionsstart</w:t>
+      </w:r>
+      <w:proofErr w:type="spellEnd"/>
+      <w:r>
+        <w:t>.</w:t>
+      </w:r>
+    </w:p>
+    <w:p>
+      <w:pPr>
+        <w:pStyle w:val="Textkrper"/>
+      </w:pPr>
+      <w:proofErr w:type="spellStart"/>
+      <w:r>
+        <w:rPr>
+          <w:b/>
+          <w:bCs/>
+        </w:rPr>
+        <w:t>Antwort</w:t>
+      </w:r>
+      <w:proofErr w:type="spellEnd"/>
+      <w:r>
+        <w:rPr>
+          <w:b/>
+          <w:bCs/>
+        </w:rPr>
+        <w:t>:</w:t>
       </w:r>
     </w:p>
     <w:p>
@@ -704,8 +2824,13 @@
           <w:numId w:val="4"/>
         </w:numPr>
       </w:pPr>
-      <w:r>
-        <w:t>Zuständige Person: ____________________________________________________</w:t>
+      <w:proofErr w:type="spellStart"/>
+      <w:r>
+        <w:t>Zuständige</w:t>
+      </w:r>
+      <w:proofErr w:type="spellEnd"/>
+      <w:r>
+        <w:t xml:space="preserve"> Person: ____________________________________________________</w:t>
       </w:r>
     </w:p>
     <w:p>
@@ -716,8 +2841,21 @@
           <w:numId w:val="4"/>
         </w:numPr>
       </w:pPr>
-      <w:r>
-        <w:t>Prüfung geplant bis: __________________________________________________</w:t>
+      <w:proofErr w:type="spellStart"/>
+      <w:r>
+        <w:t>Prüfung</w:t>
+      </w:r>
+      <w:proofErr w:type="spellEnd"/>
+      <w:r>
+        <w:t xml:space="preserve"> </w:t>
+      </w:r>
+      <w:proofErr w:type="spellStart"/>
+      <w:r>
+        <w:t>geplant</w:t>
+      </w:r>
+      <w:proofErr w:type="spellEnd"/>
+      <w:r>
+        <w:t xml:space="preserve"> bis: __________________________________________________</w:t>
       </w:r>
     </w:p>
     <w:p>
@@ -728,8 +2866,21 @@
           <w:numId w:val="4"/>
         </w:numPr>
       </w:pPr>
-      <w:r>
-        <w:t>Hinweise: _____________________________________________________________</w:t>
+      <w:proofErr w:type="spellStart"/>
+      <w:r>
+        <w:t>Hinweise</w:t>
+      </w:r>
+      <w:proofErr w:type="spellEnd"/>
+      <w:r>
+        <w:t>: _____________________________________________________________</w:t>
+      </w:r>
+    </w:p>
+    <w:p>
+      <w:pPr>
+        <w:pStyle w:val="Compact"/>
+      </w:pPr>
+      <w:r>
+        <w:t xml:space="preserve">Janay Rappelt und QM </w:t>
       </w:r>
     </w:p>
     <w:p>
@@ -739,8 +2890,21 @@
       <w:bookmarkStart w:id="11" w:name="cp-08-erster-expertenbeitrag"/>
       <w:bookmarkEnd w:id="10"/>
       <w:r>
-        <w:t>CP-08: Erster Expertenbeitrag</w:t>
-      </w:r>
+        <w:t xml:space="preserve">CP-08: </w:t>
+      </w:r>
+      <w:proofErr w:type="spellStart"/>
+      <w:r>
+        <w:t>Erster</w:t>
+      </w:r>
+      <w:proofErr w:type="spellEnd"/>
+      <w:r>
+        <w:t xml:space="preserve"> </w:t>
+      </w:r>
+      <w:proofErr w:type="spellStart"/>
+      <w:r>
+        <w:t>Expertenbeitrag</w:t>
+      </w:r>
+      <w:proofErr w:type="spellEnd"/>
     </w:p>
     <w:p>
       <w:pPr>
@@ -754,34 +2918,244 @@
         <w:t>Frage:</w:t>
       </w:r>
       <w:r>
-        <w:t xml:space="preserve"> Welcher Coach kann den ersten echten Expertenbeitrag zu einer konkreten Nutzerfrage liefern?</w:t>
+        <w:t xml:space="preserve"> </w:t>
+      </w:r>
+      <w:proofErr w:type="spellStart"/>
+      <w:r>
+        <w:t>Welcher</w:t>
+      </w:r>
+      <w:proofErr w:type="spellEnd"/>
+      <w:r>
+        <w:t xml:space="preserve"> Coach </w:t>
+      </w:r>
+      <w:proofErr w:type="spellStart"/>
+      <w:r>
+        <w:t>kann</w:t>
+      </w:r>
+      <w:proofErr w:type="spellEnd"/>
+      <w:r>
+        <w:t xml:space="preserve"> den </w:t>
+      </w:r>
+      <w:proofErr w:type="spellStart"/>
+      <w:r>
+        <w:t>ersten</w:t>
+      </w:r>
+      <w:proofErr w:type="spellEnd"/>
+      <w:r>
+        <w:t xml:space="preserve"> </w:t>
+      </w:r>
+      <w:proofErr w:type="spellStart"/>
+      <w:r>
+        <w:t>echten</w:t>
+      </w:r>
+      <w:proofErr w:type="spellEnd"/>
+      <w:r>
+        <w:t xml:space="preserve"> </w:t>
+      </w:r>
+      <w:proofErr w:type="spellStart"/>
+      <w:r>
+        <w:t>Expertenbeitrag</w:t>
+      </w:r>
+      <w:proofErr w:type="spellEnd"/>
+      <w:r>
+        <w:t xml:space="preserve"> </w:t>
+      </w:r>
+      <w:proofErr w:type="spellStart"/>
+      <w:r>
+        <w:t>zu</w:t>
+      </w:r>
+      <w:proofErr w:type="spellEnd"/>
+      <w:r>
+        <w:t xml:space="preserve"> </w:t>
+      </w:r>
+      <w:proofErr w:type="spellStart"/>
+      <w:r>
+        <w:t>einer</w:t>
+      </w:r>
+      <w:proofErr w:type="spellEnd"/>
+      <w:r>
+        <w:t xml:space="preserve"> </w:t>
+      </w:r>
+      <w:proofErr w:type="spellStart"/>
+      <w:r>
+        <w:t>konkreten</w:t>
+      </w:r>
+      <w:proofErr w:type="spellEnd"/>
+      <w:r>
+        <w:t xml:space="preserve"> </w:t>
+      </w:r>
+      <w:proofErr w:type="spellStart"/>
+      <w:r>
+        <w:t>Nutzerfrage</w:t>
+      </w:r>
+      <w:proofErr w:type="spellEnd"/>
+      <w:r>
+        <w:t xml:space="preserve"> </w:t>
+      </w:r>
+      <w:proofErr w:type="spellStart"/>
+      <w:r>
+        <w:t>liefern</w:t>
+      </w:r>
+      <w:proofErr w:type="spellEnd"/>
+      <w:r>
+        <w:t>?</w:t>
       </w:r>
     </w:p>
     <w:p>
       <w:pPr>
         <w:pStyle w:val="Textkrper"/>
       </w:pPr>
+      <w:proofErr w:type="spellStart"/>
       <w:r>
         <w:rPr>
           <w:b/>
           <w:bCs/>
         </w:rPr>
-        <w:t>Empfehlung:</w:t>
-      </w:r>
-      <w:r>
-        <w:t xml:space="preserve"> Mit einem kurzen, fachlich und redaktionell freigegebenen Beitrag beginnen. Eine allgemeine Selbstdarstellung ist dafür nicht notwendig.</w:t>
-      </w:r>
-    </w:p>
-    <w:p>
-      <w:pPr>
-        <w:pStyle w:val="Textkrper"/>
-      </w:pPr>
+        <w:t>Empfehlung</w:t>
+      </w:r>
+      <w:proofErr w:type="spellEnd"/>
       <w:r>
         <w:rPr>
           <w:b/>
           <w:bCs/>
         </w:rPr>
-        <w:t>Antwort:</w:t>
+        <w:t>:</w:t>
+      </w:r>
+      <w:r>
+        <w:t xml:space="preserve"> </w:t>
+      </w:r>
+      <w:proofErr w:type="spellStart"/>
+      <w:r>
+        <w:t>Mit</w:t>
+      </w:r>
+      <w:proofErr w:type="spellEnd"/>
+      <w:r>
+        <w:t xml:space="preserve"> </w:t>
+      </w:r>
+      <w:proofErr w:type="spellStart"/>
+      <w:r>
+        <w:t>einem</w:t>
+      </w:r>
+      <w:proofErr w:type="spellEnd"/>
+      <w:r>
+        <w:t xml:space="preserve"> </w:t>
+      </w:r>
+      <w:proofErr w:type="spellStart"/>
+      <w:r>
+        <w:t>kurzen</w:t>
+      </w:r>
+      <w:proofErr w:type="spellEnd"/>
+      <w:r>
+        <w:t xml:space="preserve">, </w:t>
+      </w:r>
+      <w:proofErr w:type="spellStart"/>
+      <w:r>
+        <w:t>fachlich</w:t>
+      </w:r>
+      <w:proofErr w:type="spellEnd"/>
+      <w:r>
+        <w:t xml:space="preserve"> und </w:t>
+      </w:r>
+      <w:proofErr w:type="spellStart"/>
+      <w:r>
+        <w:t>redaktionell</w:t>
+      </w:r>
+      <w:proofErr w:type="spellEnd"/>
+      <w:r>
+        <w:t xml:space="preserve"> </w:t>
+      </w:r>
+      <w:proofErr w:type="spellStart"/>
+      <w:r>
+        <w:t>freigegebenen</w:t>
+      </w:r>
+      <w:proofErr w:type="spellEnd"/>
+      <w:r>
+        <w:t xml:space="preserve"> </w:t>
+      </w:r>
+      <w:proofErr w:type="spellStart"/>
+      <w:r>
+        <w:t>Beitrag</w:t>
+      </w:r>
+      <w:proofErr w:type="spellEnd"/>
+      <w:r>
+        <w:t xml:space="preserve"> </w:t>
+      </w:r>
+      <w:proofErr w:type="spellStart"/>
+      <w:r>
+        <w:t>beginnen</w:t>
+      </w:r>
+      <w:proofErr w:type="spellEnd"/>
+      <w:r>
+        <w:t xml:space="preserve">. Eine </w:t>
+      </w:r>
+      <w:proofErr w:type="spellStart"/>
+      <w:r>
+        <w:t>allgemeine</w:t>
+      </w:r>
+      <w:proofErr w:type="spellEnd"/>
+      <w:r>
+        <w:t xml:space="preserve"> </w:t>
+      </w:r>
+      <w:proofErr w:type="spellStart"/>
+      <w:r>
+        <w:t>Selbstdarstellung</w:t>
+      </w:r>
+      <w:proofErr w:type="spellEnd"/>
+      <w:r>
+        <w:t xml:space="preserve"> </w:t>
+      </w:r>
+      <w:proofErr w:type="spellStart"/>
+      <w:r>
+        <w:t>ist</w:t>
+      </w:r>
+      <w:proofErr w:type="spellEnd"/>
+      <w:r>
+        <w:t xml:space="preserve"> </w:t>
+      </w:r>
+      <w:proofErr w:type="spellStart"/>
+      <w:r>
+        <w:t>dafür</w:t>
+      </w:r>
+      <w:proofErr w:type="spellEnd"/>
+      <w:r>
+        <w:t xml:space="preserve"> </w:t>
+      </w:r>
+      <w:proofErr w:type="spellStart"/>
+      <w:r>
+        <w:t>nicht</w:t>
+      </w:r>
+      <w:proofErr w:type="spellEnd"/>
+      <w:r>
+        <w:t xml:space="preserve"> </w:t>
+      </w:r>
+      <w:proofErr w:type="spellStart"/>
+      <w:r>
+        <w:t>notwendig</w:t>
+      </w:r>
+      <w:proofErr w:type="spellEnd"/>
+      <w:r>
+        <w:t>.</w:t>
+      </w:r>
+    </w:p>
+    <w:p>
+      <w:pPr>
+        <w:pStyle w:val="Textkrper"/>
+      </w:pPr>
+      <w:proofErr w:type="spellStart"/>
+      <w:r>
+        <w:rPr>
+          <w:b/>
+          <w:bCs/>
+        </w:rPr>
+        <w:t>Antwort</w:t>
+      </w:r>
+      <w:proofErr w:type="spellEnd"/>
+      <w:r>
+        <w:rPr>
+          <w:b/>
+          <w:bCs/>
+        </w:rPr>
+        <w:t>:</w:t>
       </w:r>
     </w:p>
     <w:p>
@@ -805,7 +3179,15 @@
         </w:numPr>
       </w:pPr>
       <w:r>
-        <w:t>Thema / Nutzerfrage: __________________________________________________</w:t>
+        <w:t xml:space="preserve">Thema / </w:t>
+      </w:r>
+      <w:proofErr w:type="spellStart"/>
+      <w:r>
+        <w:t>Nutzerfrage</w:t>
+      </w:r>
+      <w:proofErr w:type="spellEnd"/>
+      <w:r>
+        <w:t>: __________________________________________________</w:t>
       </w:r>
     </w:p>
     <w:p>
@@ -816,8 +3198,49 @@
           <w:numId w:val="5"/>
         </w:numPr>
       </w:pPr>
-      <w:r>
-        <w:t>Möglicher Abstimmungstermin: __________________________________________</w:t>
+      <w:proofErr w:type="spellStart"/>
+      <w:r>
+        <w:t>Möglicher</w:t>
+      </w:r>
+      <w:proofErr w:type="spellEnd"/>
+      <w:r>
+        <w:t xml:space="preserve"> </w:t>
+      </w:r>
+      <w:proofErr w:type="spellStart"/>
+      <w:r>
+        <w:t>Abstimmungstermin</w:t>
+      </w:r>
+      <w:proofErr w:type="spellEnd"/>
+      <w:r>
+        <w:t>: __________________________________________</w:t>
+      </w:r>
+    </w:p>
+    <w:p>
+      <w:pPr>
+        <w:pStyle w:val="Compact"/>
+      </w:pPr>
+    </w:p>
+    <w:p>
+      <w:pPr>
+        <w:pStyle w:val="Compact"/>
+      </w:pPr>
+      <w:r>
+        <w:rPr>
+          <mc:AlternateContent>
+            <mc:Choice Requires="w16se"/>
+            <mc:Fallback>
+              <w:rFonts w:ascii="Segoe UI Emoji" w:eastAsia="Segoe UI Emoji" w:hAnsi="Segoe UI Emoji" w:cs="Segoe UI Emoji"/>
+            </mc:Fallback>
+          </mc:AlternateContent>
+        </w:rPr>
+        <mc:AlternateContent>
+          <mc:Choice Requires="w16se">
+            <w16se:symEx w16se:font="Segoe UI Emoji" w16se:char="1F440"/>
+          </mc:Choice>
+          <mc:Fallback>
+            <w:t>👀</w:t>
+          </mc:Fallback>
+        </mc:AlternateContent>
       </w:r>
     </w:p>
     <w:p>
@@ -827,16 +3250,106 @@
       <w:bookmarkStart w:id="12" w:name="aktuelle-review-fassung"/>
       <w:bookmarkEnd w:id="3"/>
       <w:bookmarkEnd w:id="11"/>
-      <w:r>
-        <w:t>Aktuelle Review-Fassung</w:t>
-      </w:r>
+      <w:proofErr w:type="spellStart"/>
+      <w:r>
+        <w:t>Aktuelle</w:t>
+      </w:r>
+      <w:proofErr w:type="spellEnd"/>
+      <w:r>
+        <w:t xml:space="preserve"> Review-</w:t>
+      </w:r>
+      <w:proofErr w:type="spellStart"/>
+      <w:r>
+        <w:t>Fassung</w:t>
+      </w:r>
+      <w:proofErr w:type="spellEnd"/>
     </w:p>
     <w:p>
       <w:pPr>
         <w:pStyle w:val="FirstParagraph"/>
       </w:pPr>
       <w:r>
-        <w:t>Die visuelle Review-Fassung mit den beiden Unternehmensgeschichten und der freigegebenen Rückmeldung von Concept Clean ist erreichbar unter:</w:t>
+        <w:t xml:space="preserve">Die </w:t>
+      </w:r>
+      <w:proofErr w:type="spellStart"/>
+      <w:r>
+        <w:t>visuelle</w:t>
+      </w:r>
+      <w:proofErr w:type="spellEnd"/>
+      <w:r>
+        <w:t xml:space="preserve"> Review-</w:t>
+      </w:r>
+      <w:proofErr w:type="spellStart"/>
+      <w:r>
+        <w:t>Fassung</w:t>
+      </w:r>
+      <w:proofErr w:type="spellEnd"/>
+      <w:r>
+        <w:t xml:space="preserve"> </w:t>
+      </w:r>
+      <w:proofErr w:type="spellStart"/>
+      <w:r>
+        <w:t>mit</w:t>
+      </w:r>
+      <w:proofErr w:type="spellEnd"/>
+      <w:r>
+        <w:t xml:space="preserve"> den </w:t>
+      </w:r>
+      <w:proofErr w:type="spellStart"/>
+      <w:r>
+        <w:t>beiden</w:t>
+      </w:r>
+      <w:proofErr w:type="spellEnd"/>
+      <w:r>
+        <w:t xml:space="preserve"> </w:t>
+      </w:r>
+      <w:proofErr w:type="spellStart"/>
+      <w:r>
+        <w:t>Unternehmensgeschichten</w:t>
+      </w:r>
+      <w:proofErr w:type="spellEnd"/>
+      <w:r>
+        <w:t xml:space="preserve"> und der </w:t>
+      </w:r>
+      <w:proofErr w:type="spellStart"/>
+      <w:r>
+        <w:t>freigegebenen</w:t>
+      </w:r>
+      <w:proofErr w:type="spellEnd"/>
+      <w:r>
+        <w:t xml:space="preserve"> </w:t>
+      </w:r>
+      <w:proofErr w:type="spellStart"/>
+      <w:r>
+        <w:t>Rückmeldung</w:t>
+      </w:r>
+      <w:proofErr w:type="spellEnd"/>
+      <w:r>
+        <w:t xml:space="preserve"> von Concept Clean </w:t>
+      </w:r>
+      <w:proofErr w:type="spellStart"/>
+      <w:r>
+        <w:t>ist</w:t>
+      </w:r>
+      <w:proofErr w:type="spellEnd"/>
+      <w:r>
+        <w:t xml:space="preserve"> </w:t>
+      </w:r>
+      <w:proofErr w:type="spellStart"/>
+      <w:r>
+        <w:t>erreichbar</w:t>
+      </w:r>
+      <w:proofErr w:type="spellEnd"/>
+      <w:r>
+        <w:t xml:space="preserve"> </w:t>
+      </w:r>
+      <w:proofErr w:type="spellStart"/>
+      <w:r>
+        <w:t>unter</w:t>
+      </w:r>
+      <w:proofErr w:type="spellEnd"/>
+      <w:r>
+        <w:t>:</w:t>
       </w:r>
     </w:p>
     <w:p>
@@ -857,7 +3370,95 @@
         <w:pStyle w:val="Textkrper"/>
       </w:pPr>
       <w:r>
-        <w:t>Die Review-Seite ist weiterhin für Suchmaschinen gesperrt. Sie ist noch nicht die spätere produktive Veröffentlichung auf dem IONOS-Webspace.</w:t>
+        <w:t>Die Review-</w:t>
+      </w:r>
+      <w:proofErr w:type="spellStart"/>
+      <w:r>
+        <w:t>Seite</w:t>
+      </w:r>
+      <w:proofErr w:type="spellEnd"/>
+      <w:r>
+        <w:t xml:space="preserve"> </w:t>
+      </w:r>
+      <w:proofErr w:type="spellStart"/>
+      <w:r>
+        <w:t>ist</w:t>
+      </w:r>
+      <w:proofErr w:type="spellEnd"/>
+      <w:r>
+        <w:t xml:space="preserve"> </w:t>
+      </w:r>
+      <w:proofErr w:type="spellStart"/>
+      <w:r>
+        <w:t>weiterhin</w:t>
+      </w:r>
+      <w:proofErr w:type="spellEnd"/>
+      <w:r>
+        <w:t xml:space="preserve"> für </w:t>
+      </w:r>
+      <w:proofErr w:type="spellStart"/>
+      <w:r>
+        <w:t>Suchmaschinen</w:t>
+      </w:r>
+      <w:proofErr w:type="spellEnd"/>
+      <w:r>
+        <w:t xml:space="preserve"> </w:t>
+      </w:r>
+      <w:proofErr w:type="spellStart"/>
+      <w:r>
+        <w:t>gesperrt</w:t>
+      </w:r>
+      <w:proofErr w:type="spellEnd"/>
+      <w:r>
+        <w:t xml:space="preserve">. Sie </w:t>
+      </w:r>
+      <w:proofErr w:type="spellStart"/>
+      <w:r>
+        <w:t>ist</w:t>
+      </w:r>
+      <w:proofErr w:type="spellEnd"/>
+      <w:r>
+        <w:t xml:space="preserve"> </w:t>
+      </w:r>
+      <w:proofErr w:type="spellStart"/>
+      <w:r>
+        <w:t>noch</w:t>
+      </w:r>
+      <w:proofErr w:type="spellEnd"/>
+      <w:r>
+        <w:t xml:space="preserve"> </w:t>
+      </w:r>
+      <w:proofErr w:type="spellStart"/>
+      <w:r>
+        <w:t>nicht</w:t>
+      </w:r>
+      <w:proofErr w:type="spellEnd"/>
+      <w:r>
+        <w:t xml:space="preserve"> die </w:t>
+      </w:r>
+      <w:proofErr w:type="spellStart"/>
+      <w:r>
+        <w:t>spätere</w:t>
+      </w:r>
+      <w:proofErr w:type="spellEnd"/>
+      <w:r>
+        <w:t xml:space="preserve"> </w:t>
+      </w:r>
+      <w:proofErr w:type="spellStart"/>
+      <w:r>
+        <w:t>produktive</w:t>
+      </w:r>
+      <w:proofErr w:type="spellEnd"/>
+      <w:r>
+        <w:t xml:space="preserve"> </w:t>
+      </w:r>
+      <w:proofErr w:type="spellStart"/>
+      <w:r>
+        <w:t>Veröffentlichung</w:t>
+      </w:r>
+      <w:proofErr w:type="spellEnd"/>
+      <w:r>
+        <w:t xml:space="preserve"> auf dem IONOS-Webspace.</w:t>
       </w:r>
     </w:p>
     <w:p>
@@ -866,16 +3467,58 @@
       </w:pPr>
       <w:bookmarkStart w:id="13" w:name="rücklauf-und-freigabe"/>
       <w:bookmarkEnd w:id="12"/>
-      <w:r>
-        <w:t>Rücklauf und Freigabe</w:t>
-      </w:r>
+      <w:proofErr w:type="spellStart"/>
+      <w:r>
+        <w:t>Rücklauf</w:t>
+      </w:r>
+      <w:proofErr w:type="spellEnd"/>
+      <w:r>
+        <w:t xml:space="preserve"> und </w:t>
+      </w:r>
+      <w:proofErr w:type="spellStart"/>
+      <w:r>
+        <w:t>Freigabe</w:t>
+      </w:r>
+      <w:proofErr w:type="spellEnd"/>
     </w:p>
     <w:p>
       <w:pPr>
         <w:pStyle w:val="FirstParagraph"/>
       </w:pPr>
       <w:r>
-        <w:t>Der Rücklauf ist vollständig, wenn:</w:t>
+        <w:t xml:space="preserve">Der </w:t>
+      </w:r>
+      <w:proofErr w:type="spellStart"/>
+      <w:r>
+        <w:t>Rücklauf</w:t>
+      </w:r>
+      <w:proofErr w:type="spellEnd"/>
+      <w:r>
+        <w:t xml:space="preserve"> </w:t>
+      </w:r>
+      <w:proofErr w:type="spellStart"/>
+      <w:r>
+        <w:t>ist</w:t>
+      </w:r>
+      <w:proofErr w:type="spellEnd"/>
+      <w:r>
+        <w:t xml:space="preserve"> </w:t>
+      </w:r>
+      <w:proofErr w:type="spellStart"/>
+      <w:r>
+        <w:t>vollständig</w:t>
+      </w:r>
+      <w:proofErr w:type="spellEnd"/>
+      <w:r>
+        <w:t xml:space="preserve">, </w:t>
+      </w:r>
+      <w:proofErr w:type="spellStart"/>
+      <w:r>
+        <w:t>wenn</w:t>
+      </w:r>
+      <w:proofErr w:type="spellEnd"/>
+      <w:r>
+        <w:t>:</w:t>
       </w:r>
     </w:p>
     <w:p>
@@ -886,8 +3529,69 @@
           <w:numId w:val="6"/>
         </w:numPr>
       </w:pPr>
-      <w:r>
-        <w:t>jede Entscheidung freigegeben, geändert oder bewusst zurückgestellt ist;</w:t>
+      <w:proofErr w:type="spellStart"/>
+      <w:r>
+        <w:t>jede</w:t>
+      </w:r>
+      <w:proofErr w:type="spellEnd"/>
+      <w:r>
+        <w:t xml:space="preserve"> </w:t>
+      </w:r>
+      <w:proofErr w:type="spellStart"/>
+      <w:r>
+        <w:t>Entscheidung</w:t>
+      </w:r>
+      <w:proofErr w:type="spellEnd"/>
+      <w:r>
+        <w:t xml:space="preserve"> </w:t>
+      </w:r>
+      <w:proofErr w:type="spellStart"/>
+      <w:r>
+        <w:t>freigegeben</w:t>
+      </w:r>
+      <w:proofErr w:type="spellEnd"/>
+      <w:r>
+        <w:t xml:space="preserve">, </w:t>
+      </w:r>
+      <w:proofErr w:type="spellStart"/>
+      <w:r>
+        <w:t>geändert</w:t>
+      </w:r>
+      <w:proofErr w:type="spellEnd"/>
+      <w:r>
+        <w:t xml:space="preserve"> </w:t>
+      </w:r>
+      <w:proofErr w:type="spellStart"/>
+      <w:r>
+        <w:t>oder</w:t>
+      </w:r>
+      <w:proofErr w:type="spellEnd"/>
+      <w:r>
+        <w:t xml:space="preserve"> </w:t>
+      </w:r>
+      <w:proofErr w:type="spellStart"/>
+      <w:r>
+        <w:t>bewusst</w:t>
+      </w:r>
+      <w:proofErr w:type="spellEnd"/>
+      <w:r>
+        <w:t xml:space="preserve"> </w:t>
+      </w:r>
+      <w:proofErr w:type="spellStart"/>
+      <w:r>
+        <w:t>zurückgestellt</w:t>
+      </w:r>
+      <w:proofErr w:type="spellEnd"/>
+      <w:r>
+        <w:t xml:space="preserve"> </w:t>
+      </w:r>
+      <w:proofErr w:type="spellStart"/>
+      <w:r>
+        <w:t>ist</w:t>
+      </w:r>
+      <w:proofErr w:type="spellEnd"/>
+      <w:r>
+        <w:t>;</w:t>
       </w:r>
     </w:p>
     <w:p>
@@ -899,7 +3603,95 @@
         </w:numPr>
       </w:pPr>
       <w:r>
-        <w:t>für jede Kernseite redaktionelle und fachliche Verantwortung benannt oder ausdrücklich noch offen ist;</w:t>
+        <w:t xml:space="preserve">für </w:t>
+      </w:r>
+      <w:proofErr w:type="spellStart"/>
+      <w:r>
+        <w:t>jede</w:t>
+      </w:r>
+      <w:proofErr w:type="spellEnd"/>
+      <w:r>
+        <w:t xml:space="preserve"> </w:t>
+      </w:r>
+      <w:proofErr w:type="spellStart"/>
+      <w:r>
+        <w:t>Kernseite</w:t>
+      </w:r>
+      <w:proofErr w:type="spellEnd"/>
+      <w:r>
+        <w:t xml:space="preserve"> </w:t>
+      </w:r>
+      <w:proofErr w:type="spellStart"/>
+      <w:r>
+        <w:t>redaktionelle</w:t>
+      </w:r>
+      <w:proofErr w:type="spellEnd"/>
+      <w:r>
+        <w:t xml:space="preserve"> und </w:t>
+      </w:r>
+      <w:proofErr w:type="spellStart"/>
+      <w:r>
+        <w:t>fachliche</w:t>
+      </w:r>
+      <w:proofErr w:type="spellEnd"/>
+      <w:r>
+        <w:t xml:space="preserve"> </w:t>
+      </w:r>
+      <w:proofErr w:type="spellStart"/>
+      <w:r>
+        <w:t>Verantwortung</w:t>
+      </w:r>
+      <w:proofErr w:type="spellEnd"/>
+      <w:r>
+        <w:t xml:space="preserve"> </w:t>
+      </w:r>
+      <w:proofErr w:type="spellStart"/>
+      <w:r>
+        <w:t>benannt</w:t>
+      </w:r>
+      <w:proofErr w:type="spellEnd"/>
+      <w:r>
+        <w:t xml:space="preserve"> </w:t>
+      </w:r>
+      <w:proofErr w:type="spellStart"/>
+      <w:r>
+        <w:t>oder</w:t>
+      </w:r>
+      <w:proofErr w:type="spellEnd"/>
+      <w:r>
+        <w:t xml:space="preserve"> </w:t>
+      </w:r>
+      <w:proofErr w:type="spellStart"/>
+      <w:r>
+        <w:t>ausdrücklich</w:t>
+      </w:r>
+      <w:proofErr w:type="spellEnd"/>
+      <w:r>
+        <w:t xml:space="preserve"> </w:t>
+      </w:r>
+      <w:proofErr w:type="spellStart"/>
+      <w:r>
+        <w:t>noch</w:t>
+      </w:r>
+      <w:proofErr w:type="spellEnd"/>
+      <w:r>
+        <w:t xml:space="preserve"> </w:t>
+      </w:r>
+      <w:proofErr w:type="spellStart"/>
+      <w:r>
+        <w:t>offen</w:t>
+      </w:r>
+      <w:proofErr w:type="spellEnd"/>
+      <w:r>
+        <w:t xml:space="preserve"> </w:t>
+      </w:r>
+      <w:proofErr w:type="spellStart"/>
+      <w:r>
+        <w:t>ist</w:t>
+      </w:r>
+      <w:proofErr w:type="spellEnd"/>
+      <w:r>
+        <w:t>;</w:t>
       </w:r>
     </w:p>
     <w:p>
@@ -910,8 +3702,61 @@
           <w:numId w:val="6"/>
         </w:numPr>
       </w:pPr>
-      <w:r>
-        <w:t>kommerzielle Angaben eine verantwortliche Prüfung und ein Datum erhalten;</w:t>
+      <w:proofErr w:type="spellStart"/>
+      <w:r>
+        <w:t>kommerzielle</w:t>
+      </w:r>
+      <w:proofErr w:type="spellEnd"/>
+      <w:r>
+        <w:t xml:space="preserve"> </w:t>
+      </w:r>
+      <w:proofErr w:type="spellStart"/>
+      <w:r>
+        <w:t>Angaben</w:t>
+      </w:r>
+      <w:proofErr w:type="spellEnd"/>
+      <w:r>
+        <w:t xml:space="preserve"> </w:t>
+      </w:r>
+      <w:proofErr w:type="spellStart"/>
+      <w:r>
+        <w:t>eine</w:t>
+      </w:r>
+      <w:proofErr w:type="spellEnd"/>
+      <w:r>
+        <w:t xml:space="preserve"> </w:t>
+      </w:r>
+      <w:proofErr w:type="spellStart"/>
+      <w:r>
+        <w:t>verantwortliche</w:t>
+      </w:r>
+      <w:proofErr w:type="spellEnd"/>
+      <w:r>
+        <w:t xml:space="preserve"> </w:t>
+      </w:r>
+      <w:proofErr w:type="spellStart"/>
+      <w:r>
+        <w:t>Prüfung</w:t>
+      </w:r>
+      <w:proofErr w:type="spellEnd"/>
+      <w:r>
+        <w:t xml:space="preserve"> und </w:t>
+      </w:r>
+      <w:proofErr w:type="spellStart"/>
+      <w:r>
+        <w:t>ein</w:t>
+      </w:r>
+      <w:proofErr w:type="spellEnd"/>
+      <w:r>
+        <w:t xml:space="preserve"> Datum </w:t>
+      </w:r>
+      <w:proofErr w:type="spellStart"/>
+      <w:r>
+        <w:t>erhalten</w:t>
+      </w:r>
+      <w:proofErr w:type="spellEnd"/>
+      <w:r>
+        <w:t>;</w:t>
       </w:r>
     </w:p>
     <w:p>
@@ -922,8 +3767,69 @@
           <w:numId w:val="6"/>
         </w:numPr>
       </w:pPr>
-      <w:r>
-        <w:t>fachliche Grenzen und Expertenbeiträge nicht ohne Freigabe veröffentlicht werden.</w:t>
+      <w:proofErr w:type="spellStart"/>
+      <w:r>
+        <w:t>fachliche</w:t>
+      </w:r>
+      <w:proofErr w:type="spellEnd"/>
+      <w:r>
+        <w:t xml:space="preserve"> </w:t>
+      </w:r>
+      <w:proofErr w:type="spellStart"/>
+      <w:r>
+        <w:t>Grenzen</w:t>
+      </w:r>
+      <w:proofErr w:type="spellEnd"/>
+      <w:r>
+        <w:t xml:space="preserve"> und </w:t>
+      </w:r>
+      <w:proofErr w:type="spellStart"/>
+      <w:r>
+        <w:t>Expertenbeiträge</w:t>
+      </w:r>
+      <w:proofErr w:type="spellEnd"/>
+      <w:r>
+        <w:t xml:space="preserve"> </w:t>
+      </w:r>
+      <w:proofErr w:type="spellStart"/>
+      <w:r>
+        <w:t>nicht</w:t>
+      </w:r>
+      <w:proofErr w:type="spellEnd"/>
+      <w:r>
+        <w:t xml:space="preserve"> </w:t>
+      </w:r>
+      <w:proofErr w:type="spellStart"/>
+      <w:r>
+        <w:t>ohne</w:t>
+      </w:r>
+      <w:proofErr w:type="spellEnd"/>
+      <w:r>
+        <w:t xml:space="preserve"> </w:t>
+      </w:r>
+      <w:proofErr w:type="spellStart"/>
+      <w:r>
+        <w:t>Freigabe</w:t>
+      </w:r>
+      <w:proofErr w:type="spellEnd"/>
+      <w:r>
+        <w:t xml:space="preserve"> </w:t>
+      </w:r>
+      <w:proofErr w:type="spellStart"/>
+      <w:r>
+        <w:t>veröffentlicht</w:t>
+      </w:r>
+      <w:proofErr w:type="spellEnd"/>
+      <w:r>
+        <w:t xml:space="preserve"> </w:t>
+      </w:r>
+      <w:proofErr w:type="spellStart"/>
+      <w:r>
+        <w:t>werden</w:t>
+      </w:r>
+      <w:proofErr w:type="spellEnd"/>
+      <w:r>
+        <w:t>.</w:t>
       </w:r>
     </w:p>
     <w:p>
@@ -931,7 +3837,79 @@
         <w:pStyle w:val="FirstParagraph"/>
       </w:pPr>
       <w:r>
-        <w:t>Die visuelle Rückmeldung zur Review-Seite kann unabhängig von diesen Entscheidungen erfolgen.</w:t>
+        <w:t xml:space="preserve">Die </w:t>
+      </w:r>
+      <w:proofErr w:type="spellStart"/>
+      <w:r>
+        <w:t>visuelle</w:t>
+      </w:r>
+      <w:proofErr w:type="spellEnd"/>
+      <w:r>
+        <w:t xml:space="preserve"> </w:t>
+      </w:r>
+      <w:proofErr w:type="spellStart"/>
+      <w:r>
+        <w:t>Rückmeldung</w:t>
+      </w:r>
+      <w:proofErr w:type="spellEnd"/>
+      <w:r>
+        <w:t xml:space="preserve"> </w:t>
+      </w:r>
+      <w:proofErr w:type="spellStart"/>
+      <w:r>
+        <w:t>zur</w:t>
+      </w:r>
+      <w:proofErr w:type="spellEnd"/>
+      <w:r>
+        <w:t xml:space="preserve"> Review-</w:t>
+      </w:r>
+      <w:proofErr w:type="spellStart"/>
+      <w:r>
+        <w:t>Seite</w:t>
+      </w:r>
+      <w:proofErr w:type="spellEnd"/>
+      <w:r>
+        <w:t xml:space="preserve"> </w:t>
+      </w:r>
+      <w:proofErr w:type="spellStart"/>
+      <w:r>
+        <w:t>kann</w:t>
+      </w:r>
+      <w:proofErr w:type="spellEnd"/>
+      <w:r>
+        <w:t xml:space="preserve"> </w:t>
+      </w:r>
+      <w:proofErr w:type="spellStart"/>
+      <w:r>
+        <w:t>unabhängig</w:t>
+      </w:r>
+      <w:proofErr w:type="spellEnd"/>
+      <w:r>
+        <w:t xml:space="preserve"> von </w:t>
+      </w:r>
+      <w:proofErr w:type="spellStart"/>
+      <w:r>
+        <w:t>diesen</w:t>
+      </w:r>
+      <w:proofErr w:type="spellEnd"/>
+      <w:r>
+        <w:t xml:space="preserve"> </w:t>
+      </w:r>
+      <w:proofErr w:type="spellStart"/>
+      <w:r>
+        <w:t>Entscheidungen</w:t>
+      </w:r>
+      <w:proofErr w:type="spellEnd"/>
+      <w:r>
+        <w:t xml:space="preserve"> </w:t>
+      </w:r>
+      <w:proofErr w:type="spellStart"/>
+      <w:r>
+        <w:t>erfolgen</w:t>
+      </w:r>
+      <w:proofErr w:type="spellEnd"/>
+      <w:r>
+        <w:t>.</w:t>
       </w:r>
       <w:bookmarkEnd w:id="13"/>
     </w:p>
@@ -949,7 +3927,7 @@
 </file>
 
 <file path=word/numbering.xml><?xml version="1.0" encoding="utf-8"?>
-<w:numbering xmlns:wpc="http://schemas.microsoft.com/office/word/2010/wordprocessingCanvas" xmlns:cx="http://schemas.microsoft.com/office/drawing/2014/chartex" xmlns:cx1="http://schemas.microsoft.com/office/drawing/2015/9/8/chartex" xmlns:cx2="http://schemas.microsoft.com/office/drawing/2015/10/21/chartex" xmlns:cx3="http://schemas.microsoft.com/office/drawing/2016/5/9/chartex" xmlns:cx4="http://schemas.microsoft.com/office/drawing/2016/5/10/chartex" xmlns:cx5="http://schemas.microsoft.com/office/drawing/2016/5/11/chartex" xmlns:cx6="http://schemas.microsoft.com/office/drawing/2016/5/12/chartex" xmlns:cx7="http://schemas.microsoft.com/office/drawing/2016/5/13/chartex" xmlns:cx8="http://schemas.microsoft.com/office/drawing/2016/5/14/chartex" xmlns:mc="http://schemas.openxmlformats.org/markup-compatibility/2006" xmlns:aink="http://schemas.microsoft.com/office/drawing/2016/ink" xmlns:am3d="http://schemas.microsoft.com/office/drawing/2017/model3d" xmlns:o="urn:schemas-microsoft-com:office:office" xmlns:oel="http://schemas.microsoft.com/office/2019/extlst" xmlns:r="http://schemas.openxmlformats.org/officeDocument/2006/relationships" xmlns:m="http://schemas.openxmlformats.org/officeDocument/2006/math" xmlns:v="urn:schemas-microsoft-com:vml" xmlns:wp14="http://schemas.microsoft.com/office/word/2010/wordprocessingDrawing" xmlns:wp="http://schemas.openxmlformats.org/drawingml/2006/wordprocessingDrawing" xmlns:w10="urn:schemas-microsoft-com:office:word" xmlns:w="http://schemas.openxmlformats.org/wordprocessingml/2006/main" xmlns:w14="http://schemas.microsoft.com/office/word/2010/wordml" xmlns:w15="http://schemas.microsoft.com/office/word/2012/wordml" xmlns:w16cex="http://schemas.microsoft.com/office/word/2018/wordml/cex" xmlns:w16cid="http://schemas.microsoft.com/office/word/2016/wordml/cid" xmlns:w16="http://schemas.microsoft.com/office/word/2018/wordml" xmlns:w16du="http://schemas.microsoft.com/office/word/2023/wordml/word16du" xmlns:w16sdtdh="http://schemas.microsoft.com/office/word/2020/wordml/sdtdatahash" xmlns:w16sdtfl="http://schemas.microsoft.com/office/word/2024/wordml/sdtformatlock" xmlns:w16se="http://schemas.microsoft.com/office/word/2015/wordml/symex" xmlns:wpg="http://schemas.microsoft.com/office/word/2010/wordprocessingGroup" xmlns:wpi="http://schemas.microsoft.com/office/word/2010/wordprocessingInk" xmlns:wne="http://schemas.microsoft.com/office/word/2006/wordml" xmlns:wps="http://schemas.microsoft.com/office/word/2010/wordprocessingShape" mc:Ignorable="w14 w15 w16se w16cid w16 w16cex w16sdtdh w16sdtfl w16du wp14">
+<w:numbering xmlns:wpc="http://schemas.microsoft.com/office/word/2010/wordprocessingCanvas" xmlns:cx="http://schemas.microsoft.com/office/drawing/2014/chartex" xmlns:cx1="http://schemas.microsoft.com/office/drawing/2015/9/8/chartex" xmlns:cx2="http://schemas.microsoft.com/office/drawing/2015/10/21/chartex" xmlns:cx3="http://schemas.microsoft.com/office/drawing/2016/5/9/chartex" xmlns:cx4="http://schemas.microsoft.com/office/drawing/2016/5/10/chartex" xmlns:cx5="http://schemas.microsoft.com/office/drawing/2016/5/11/chartex" xmlns:cx6="http://schemas.microsoft.com/office/drawing/2016/5/12/chartex" xmlns:cx7="http://schemas.microsoft.com/office/drawing/2016/5/13/chartex" xmlns:cx8="http://schemas.microsoft.com/office/drawing/2016/5/14/chartex" xmlns:mc="http://schemas.openxmlformats.org/markup-compatibility/2006" xmlns:aink="http://schemas.microsoft.com/office/drawing/2016/ink" xmlns:am3d="http://schemas.microsoft.com/office/drawing/2017/model3d" xmlns:o="urn:schemas-microsoft-com:office:office" xmlns:oel="http://schemas.microsoft.com/office/2019/extlst" xmlns:r="http://schemas.openxmlformats.org/officeDocument/2006/relationships" xmlns:m="http://schemas.openxmlformats.org/officeDocument/2006/math" xmlns:v="urn:schemas-microsoft-com:vml" xmlns:wp14="http://schemas.microsoft.com/office/word/2010/wordprocessingDrawing" xmlns:wp="http://schemas.openxmlformats.org/drawingml/2006/wordprocessingDrawing" xmlns:w10="urn:schemas-microsoft-com:office:word" xmlns:w="http://schemas.openxmlformats.org/wordprocessingml/2006/main" xmlns:w14="http://schemas.microsoft.com/office/word/2010/wordml" xmlns:w15="http://schemas.microsoft.com/office/word/2012/wordml" xmlns:w16cex="http://schemas.microsoft.com/office/word/2018/wordml/cex" xmlns:w16cid="http://schemas.microsoft.com/office/word/2016/wordml/cid" xmlns:w16="http://schemas.microsoft.com/office/word/2018/wordml" xmlns:w16sdtdh="http://schemas.microsoft.com/office/word/2020/wordml/sdtdatahash" xmlns:w16se="http://schemas.microsoft.com/office/word/2015/wordml/symex" xmlns:wpg="http://schemas.microsoft.com/office/word/2010/wordprocessingGroup" xmlns:wpi="http://schemas.microsoft.com/office/word/2010/wordprocessingInk" xmlns:wne="http://schemas.microsoft.com/office/word/2006/wordml" xmlns:wps="http://schemas.microsoft.com/office/word/2010/wordprocessingShape" mc:Ignorable="w14 w15 w16se w16cid w16 w16cex w16sdtdh wp14">
   <w:abstractNum w:abstractNumId="0" w15:restartNumberingAfterBreak="0">
     <w:nsid w:val="0000A990"/>
     <w:multiLevelType w:val="multilevel"/>
@@ -1153,7 +4131,7 @@
 </file>
 
 <file path=word/styles.xml><?xml version="1.0" encoding="utf-8"?>
-<w:styles xmlns:mc="http://schemas.openxmlformats.org/markup-compatibility/2006" xmlns:r="http://schemas.openxmlformats.org/officeDocument/2006/relationships" xmlns:w="http://schemas.openxmlformats.org/wordprocessingml/2006/main" xmlns:w14="http://schemas.microsoft.com/office/word/2010/wordml" xmlns:w15="http://schemas.microsoft.com/office/word/2012/wordml" xmlns:w16cex="http://schemas.microsoft.com/office/word/2018/wordml/cex" xmlns:w16cid="http://schemas.microsoft.com/office/word/2016/wordml/cid" xmlns:w16="http://schemas.microsoft.com/office/word/2018/wordml" xmlns:w16du="http://schemas.microsoft.com/office/word/2023/wordml/word16du" xmlns:w16sdtdh="http://schemas.microsoft.com/office/word/2020/wordml/sdtdatahash" xmlns:w16sdtfl="http://schemas.microsoft.com/office/word/2024/wordml/sdtformatlock" xmlns:w16se="http://schemas.microsoft.com/office/word/2015/wordml/symex" mc:Ignorable="w14 w15 w16se w16cid w16 w16cex w16sdtdh w16sdtfl w16du">
+<w:styles xmlns:mc="http://schemas.openxmlformats.org/markup-compatibility/2006" xmlns:r="http://schemas.openxmlformats.org/officeDocument/2006/relationships" xmlns:w="http://schemas.openxmlformats.org/wordprocessingml/2006/main" xmlns:w14="http://schemas.microsoft.com/office/word/2010/wordml" xmlns:w15="http://schemas.microsoft.com/office/word/2012/wordml" xmlns:w16cex="http://schemas.microsoft.com/office/word/2018/wordml/cex" xmlns:w16cid="http://schemas.microsoft.com/office/word/2016/wordml/cid" xmlns:w16="http://schemas.microsoft.com/office/word/2018/wordml" xmlns:w16sdtdh="http://schemas.microsoft.com/office/word/2020/wordml/sdtdatahash" xmlns:w16se="http://schemas.microsoft.com/office/word/2015/wordml/symex" mc:Ignorable="w14 w15 w16se w16cid w16 w16cex w16sdtdh">
   <w:docDefaults>
     <w:rPrDefault>
       <w:rPr>

</xml_diff>